<commit_message>
Update all resume downloads to the formatted resume with portfolio link
</commit_message>
<xml_diff>
--- a/Hari_Simran_Khalsa_Operations_Resume.docx
+++ b/Hari_Simran_Khalsa_Operations_Resume.docx
@@ -11,18 +11,41 @@
       </w:r>
     </w:p>
     <w:p>
+      <w:r>
+        <w:t xml:space="preserve">Dublin, Ohio  |  </w:t>
+      </w:r>
+      <w:hyperlink r:id="rId9">
+        <w:r>
+          <w:rPr>
+            <w:color w:val="214EAC"/>
+            <w:u w:val="single"/>
+          </w:rPr>
+          <w:t>hkhalsa095@gmail.com</w:t>
+        </w:r>
+      </w:hyperlink>
+    </w:p>
+    <w:p>
       <w:pPr>
         <w:spacing w:after="140"/>
       </w:pPr>
       <w:r>
-        <w:t>Dublin, Ohio  |  hkhalsa095@gmail.com</w:t>
+        <w:t xml:space="preserve">Portfolio: </w:t>
       </w:r>
+      <w:hyperlink r:id="rId10">
+        <w:r>
+          <w:rPr>
+            <w:color w:val="214EAC"/>
+            <w:u w:val="single"/>
+          </w:rPr>
+          <w:t>sfskhalsa101.github.io/hari-simran-khalsa-portfolio</w:t>
+        </w:r>
+      </w:hyperlink>
     </w:p>
     <w:p>
       <w:r>
         <w:rPr>
           <w:b/>
-          <w:sz w:val="22"/>
+          <w:sz w:val="20"/>
         </w:rPr>
         <w:t>OPERATIONS LEADERSHIP AND PROCESS IMPROVEMENT</w:t>
       </w:r>
@@ -32,7 +55,7 @@
         <w:pStyle w:val="Heading1"/>
       </w:pPr>
       <w:r>
-        <w:t>Professional Summary</w:t>
+        <w:t>PROFESSIONAL SUMMARY</w:t>
       </w:r>
     </w:p>
     <w:p>
@@ -45,7 +68,7 @@
         <w:pStyle w:val="Heading1"/>
       </w:pPr>
       <w:r>
-        <w:t>Core Capabilities</w:t>
+        <w:t>CORE CAPABILITIES</w:t>
       </w:r>
     </w:p>
     <w:p>
@@ -58,15 +81,26 @@
         <w:pStyle w:val="Heading1"/>
       </w:pPr>
       <w:r>
-        <w:t>Professional Experience</w:t>
+        <w:t>PROFESSIONAL EXPERIENCE</w:t>
       </w:r>
     </w:p>
     <w:p>
       <w:pPr>
         <w:pStyle w:val="Heading2"/>
+        <w:tabs>
+          <w:tab w:pos="10368" w:val="right"/>
+        </w:tabs>
       </w:pPr>
       <w:r>
-        <w:t>FedEx  |  Operations Supervisor</w:t>
+        <w:t>FedEx</w:t>
+      </w:r>
+      <w:r>
+        <w:rPr>
+          <w:b w:val="0"/>
+          <w:sz w:val="19"/>
+        </w:rPr>
+        <w:tab/>
+        <w:t>June 2026 – Present</w:t>
       </w:r>
     </w:p>
     <w:p>
@@ -76,16 +110,18 @@
       </w:pPr>
       <w:r>
         <w:rPr>
-          <w:color w:val="4B4B4B"/>
-          <w:sz w:val="19"/>
+          <w:i/>
         </w:rPr>
-        <w:t>June 2026 - Present | Plain City, Ohio</w:t>
+        <w:t>Operations Supervisor · Plain City, Ohio</w:t>
       </w:r>
     </w:p>
     <w:p>
       <w:pPr>
         <w:pStyle w:val="ListBullet"/>
-        <w:keepLines/>
+        <w:numPr>
+          <w:ilvl w:val="0"/>
+          <w:numId w:val="40"/>
+        </w:numPr>
       </w:pPr>
       <w:r>
         <w:t>Lead staffing, package-flow execution, frontline coaching, quality coordination, and operational recovery in a high-volume parcel facility; use Blue Yonder for attendance and staffing workflows.</w:t>
@@ -94,7 +130,10 @@
     <w:p>
       <w:pPr>
         <w:pStyle w:val="ListBullet"/>
-        <w:keepLines/>
+        <w:numPr>
+          <w:ilvl w:val="0"/>
+          <w:numId w:val="40"/>
+        </w:numPr>
       </w:pPr>
       <w:r>
         <w:t>Covered unload and two load areas during a shift processing 73,000 packages, coordinating 40 people in unload and 28 across the load areas.</w:t>
@@ -103,7 +142,10 @@
     <w:p>
       <w:pPr>
         <w:pStyle w:val="ListBullet"/>
-        <w:keepLines/>
+        <w:numPr>
+          <w:ilvl w:val="0"/>
+          <w:numId w:val="40"/>
+        </w:numPr>
       </w:pPr>
       <w:r>
         <w:t>Achieved peak unload throughput of 17,000 packages per hour before a sorter interruption during that shift.</w:t>
@@ -112,7 +154,10 @@
     <w:p>
       <w:pPr>
         <w:pStyle w:val="ListBullet"/>
-        <w:keepLines/>
+        <w:numPr>
+          <w:ilvl w:val="0"/>
+          <w:numId w:val="40"/>
+        </w:numPr>
       </w:pPr>
       <w:r>
         <w:t>Develop trainers to run their areas, coordinate quality issues with support teams, and provide new supervisors with work methods, standards, and documentation resources.</w:t>
@@ -121,9 +166,20 @@
     <w:p>
       <w:pPr>
         <w:pStyle w:val="Heading2"/>
+        <w:tabs>
+          <w:tab w:pos="10368" w:val="right"/>
+        </w:tabs>
       </w:pPr>
       <w:r>
-        <w:t>Hidaka USA  |  TMS/WMS Specialist and Shipping Associate</w:t>
+        <w:t>Hidaka USA</w:t>
+      </w:r>
+      <w:r>
+        <w:rPr>
+          <w:b w:val="0"/>
+          <w:sz w:val="19"/>
+        </w:rPr>
+        <w:tab/>
+        <w:t>2026</w:t>
       </w:r>
     </w:p>
     <w:p>
@@ -133,16 +189,18 @@
       </w:pPr>
       <w:r>
         <w:rPr>
-          <w:color w:val="4B4B4B"/>
-          <w:sz w:val="19"/>
+          <w:i/>
         </w:rPr>
-        <w:t>2026</w:t>
+        <w:t>TMS/WMS Specialist and Shipping Associate</w:t>
       </w:r>
     </w:p>
     <w:p>
       <w:pPr>
         <w:pStyle w:val="ListBullet"/>
-        <w:keepLines/>
+        <w:numPr>
+          <w:ilvl w:val="0"/>
+          <w:numId w:val="40"/>
+        </w:numPr>
       </w:pPr>
       <w:r>
         <w:t>Supported manufacturing logistics through transportation and warehouse systems, outbound freight, receiving, inventory movement, and production coordination.</w:t>
@@ -151,7 +209,10 @@
     <w:p>
       <w:pPr>
         <w:pStyle w:val="ListBullet"/>
-        <w:keepLines/>
+        <w:numPr>
+          <w:ilvl w:val="0"/>
+          <w:numId w:val="40"/>
+        </w:numPr>
       </w:pPr>
       <w:r>
         <w:t>Maintained zero shipping and quality errors over three months; implemented workflow improvements producing approximately $2,000 in weekly savings.</w:t>
@@ -160,9 +221,20 @@
     <w:p>
       <w:pPr>
         <w:pStyle w:val="Heading2"/>
+        <w:tabs>
+          <w:tab w:pos="10368" w:val="right"/>
+        </w:tabs>
       </w:pPr>
       <w:r>
-        <w:t>Schneider  |  Transportation Planning and Dispatch</w:t>
+        <w:t>Schneider</w:t>
+      </w:r>
+      <w:r>
+        <w:rPr>
+          <w:b w:val="0"/>
+          <w:sz w:val="19"/>
+        </w:rPr>
+        <w:tab/>
+        <w:t>2025</w:t>
       </w:r>
     </w:p>
     <w:p>
@@ -172,38 +244,50 @@
       </w:pPr>
       <w:r>
         <w:rPr>
-          <w:color w:val="4B4B4B"/>
-          <w:sz w:val="19"/>
+          <w:i/>
         </w:rPr>
-        <w:t>2025</w:t>
+        <w:t>Transportation Planning and Dispatch</w:t>
       </w:r>
     </w:p>
     <w:p>
       <w:pPr>
         <w:pStyle w:val="ListBullet"/>
-        <w:keepLines/>
+        <w:numPr>
+          <w:ilvl w:val="0"/>
+          <w:numId w:val="40"/>
+        </w:numPr>
       </w:pPr>
       <w:r>
         <w:t>Coordinated fleet dispatch, transportation scheduling, shipment tracking, and operational reporting; resolved scheduling conflicts and maintained transportation documentation.</w:t>
       </w:r>
     </w:p>
     <w:p>
-      <w:r/>
-    </w:p>
-    <w:p>
       <w:pPr>
         <w:pStyle w:val="Heading1"/>
+        <w:pageBreakBefore/>
+        <w:spacing w:before="0"/>
       </w:pPr>
       <w:r>
-        <w:t>Professional Experience Continued</w:t>
+        <w:t>PROFESSIONAL EXPERIENCE CONTINUED</w:t>
       </w:r>
     </w:p>
     <w:p>
       <w:pPr>
         <w:pStyle w:val="Heading2"/>
+        <w:tabs>
+          <w:tab w:pos="10368" w:val="right"/>
+        </w:tabs>
       </w:pPr>
       <w:r>
-        <w:t>Target  |  Security Specialist in Asset Protection</w:t>
+        <w:t>Target</w:t>
+      </w:r>
+      <w:r>
+        <w:rPr>
+          <w:b w:val="0"/>
+          <w:sz w:val="19"/>
+        </w:rPr>
+        <w:tab/>
+        <w:t>2024 – 2025</w:t>
       </w:r>
     </w:p>
     <w:p>
@@ -213,16 +297,18 @@
       </w:pPr>
       <w:r>
         <w:rPr>
-          <w:color w:val="4B4B4B"/>
-          <w:sz w:val="19"/>
+          <w:i/>
         </w:rPr>
-        <w:t>2024 - 2025</w:t>
+        <w:t>Security Specialist in Asset Protection</w:t>
       </w:r>
     </w:p>
     <w:p>
       <w:pPr>
         <w:pStyle w:val="ListBullet"/>
-        <w:keepLines/>
+        <w:numPr>
+          <w:ilvl w:val="0"/>
+          <w:numId w:val="40"/>
+        </w:numPr>
       </w:pPr>
       <w:r>
         <w:t>Supported theft and fraud investigations through evidence collection, case documentation, and coordination with law enforcement; maintained safety and asset-protection standards.</w:t>
@@ -231,7 +317,10 @@
     <w:p>
       <w:pPr>
         <w:pStyle w:val="ListBullet"/>
-        <w:keepLines/>
+        <w:numPr>
+          <w:ilvl w:val="0"/>
+          <w:numId w:val="40"/>
+        </w:numPr>
       </w:pPr>
       <w:r>
         <w:t>Worked with TrueEye and TruScan automated skip-scan detection workflows and supported retail loss-prevention operations.</w:t>
@@ -240,9 +329,20 @@
     <w:p>
       <w:pPr>
         <w:pStyle w:val="Heading2"/>
+        <w:tabs>
+          <w:tab w:pos="10368" w:val="right"/>
+        </w:tabs>
       </w:pPr>
       <w:r>
-        <w:t>UPS  |  Dispatch and Building Automation Supervisor</w:t>
+        <w:t>UPS</w:t>
+      </w:r>
+      <w:r>
+        <w:rPr>
+          <w:b w:val="0"/>
+          <w:sz w:val="19"/>
+        </w:rPr>
+        <w:tab/>
+        <w:t>January 2023 – May 2024</w:t>
       </w:r>
     </w:p>
     <w:p>
@@ -252,16 +352,18 @@
       </w:pPr>
       <w:r>
         <w:rPr>
-          <w:color w:val="4B4B4B"/>
-          <w:sz w:val="19"/>
+          <w:i/>
         </w:rPr>
-        <w:t>January 2023 - May 2024</w:t>
+        <w:t>Dispatch and Building Automation Supervisor</w:t>
       </w:r>
     </w:p>
     <w:p>
       <w:pPr>
         <w:pStyle w:val="ListBullet"/>
-        <w:keepLines/>
+        <w:numPr>
+          <w:ilvl w:val="0"/>
+          <w:numId w:val="40"/>
+        </w:numPr>
       </w:pPr>
       <w:r>
         <w:t>Coordinated 70 drivers across multiple municipalities, managing route priorities, dispatch, transportation disruptions, and daily service execution.</w:t>
@@ -270,7 +372,10 @@
     <w:p>
       <w:pPr>
         <w:pStyle w:val="ListBullet"/>
-        <w:keepLines/>
+        <w:numPr>
+          <w:ilvl w:val="0"/>
+          <w:numId w:val="40"/>
+        </w:numPr>
       </w:pPr>
       <w:r>
         <w:t>Generated approximately $86,000 in estimated annual logistics savings through route optimization and workflow improvements; reduced overtime by 20% through workforce balancing.</w:t>
@@ -279,7 +384,10 @@
     <w:p>
       <w:pPr>
         <w:pStyle w:val="ListBullet"/>
-        <w:keepLines/>
+        <w:numPr>
+          <w:ilvl w:val="0"/>
+          <w:numId w:val="40"/>
+        </w:numPr>
       </w:pPr>
       <w:r>
         <w:t>Managed driver communication and real-time operating adjustments while monitoring automated sort-system conditions and maintaining service reliability.</w:t>
@@ -288,9 +396,20 @@
     <w:p>
       <w:pPr>
         <w:pStyle w:val="Heading2"/>
+        <w:tabs>
+          <w:tab w:pos="10368" w:val="right"/>
+        </w:tabs>
       </w:pPr>
       <w:r>
-        <w:t>UPS  |  Operations Supervisor</w:t>
+        <w:t>UPS</w:t>
+      </w:r>
+      <w:r>
+        <w:rPr>
+          <w:b w:val="0"/>
+          <w:sz w:val="19"/>
+        </w:rPr>
+        <w:tab/>
+        <w:t>August 2020 – December 2022</w:t>
       </w:r>
     </w:p>
     <w:p>
@@ -300,16 +419,18 @@
       </w:pPr>
       <w:r>
         <w:rPr>
-          <w:color w:val="4B4B4B"/>
-          <w:sz w:val="19"/>
+          <w:i/>
         </w:rPr>
-        <w:t>August 2020 - December 2022</w:t>
+        <w:t>Operations Supervisor</w:t>
       </w:r>
     </w:p>
     <w:p>
       <w:pPr>
         <w:pStyle w:val="ListBullet"/>
-        <w:keepLines/>
+        <w:numPr>
+          <w:ilvl w:val="0"/>
+          <w:numId w:val="40"/>
+        </w:numPr>
       </w:pPr>
       <w:r>
         <w:t>Led 70+ employees in a high-volume package distribution operation, managing labor allocation, quality, safety, service performance, and employee development.</w:t>
@@ -318,7 +439,10 @@
     <w:p>
       <w:pPr>
         <w:pStyle w:val="ListBullet"/>
-        <w:keepLines/>
+        <w:numPr>
+          <w:ilvl w:val="0"/>
+          <w:numId w:val="40"/>
+        </w:numPr>
       </w:pPr>
       <w:r>
         <w:t>Reduced daily misloads from approximately 100 to fewer than 10 over three months through process improvement and frontline coaching; approximately $1.17 million in estimated annualized cost avoidance using 90 fewer misloads per day x $50 x 260 operating days.</w:t>
@@ -327,7 +451,10 @@
     <w:p>
       <w:pPr>
         <w:pStyle w:val="ListBullet"/>
-        <w:keepLines/>
+        <w:numPr>
+          <w:ilvl w:val="0"/>
+          <w:numId w:val="40"/>
+        </w:numPr>
       </w:pPr>
       <w:r>
         <w:t>Led operations supporting Pfizer COVID-19 vaccine distribution with zero distribution failures and 100% chain-of-custody integrity.</w:t>
@@ -338,7 +465,7 @@
         <w:pStyle w:val="Heading1"/>
       </w:pPr>
       <w:r>
-        <w:t>Independent Product Delivery</w:t>
+        <w:t>INDEPENDENT PRODUCT DELIVERY</w:t>
       </w:r>
     </w:p>
     <w:p>
@@ -346,35 +473,39 @@
         <w:pStyle w:val="Heading2"/>
       </w:pPr>
       <w:r>
-        <w:t>Security Flaw Solutions  |  Founder and Lead Developer</w:t>
+        <w:t>Security Flaw Solutions</w:t>
       </w:r>
     </w:p>
     <w:p>
       <w:pPr>
         <w:keepNext/>
-        <w:spacing w:after="80"/>
       </w:pPr>
       <w:r>
         <w:rPr>
-          <w:color w:val="4B4B4B"/>
-          <w:sz w:val="19"/>
+          <w:i/>
         </w:rPr>
-        <w:t>AIncident | Commercial sale completed May 2026</w:t>
+        <w:t>Founder and Lead Developer · AIncident</w:t>
       </w:r>
     </w:p>
     <w:p>
       <w:pPr>
         <w:pStyle w:val="ListBullet"/>
-        <w:keepLines/>
+        <w:numPr>
+          <w:ilvl w:val="0"/>
+          <w:numId w:val="40"/>
+        </w:numPr>
       </w:pPr>
       <w:r>
-        <w:t>Designed, built, deployed, and sold an AI-powered operational reporting platform for $5,000, taking the product from requirements through commercial delivery.</w:t>
+        <w:t>Designed, built, deployed, and sold an AI-powered operational reporting platform for $4,995, taking the product from requirements through commercial delivery.</w:t>
       </w:r>
     </w:p>
     <w:p>
       <w:pPr>
         <w:pStyle w:val="ListBullet"/>
-        <w:keepLines/>
+        <w:numPr>
+          <w:ilvl w:val="0"/>
+          <w:numId w:val="40"/>
+        </w:numPr>
       </w:pPr>
       <w:r>
         <w:t>Built application workflows with Python, FastAPI, PostgreSQL, and Streamlit; applied operational experience to structured reporting and usable software.</w:t>
@@ -385,7 +516,7 @@
         <w:pStyle w:val="Heading1"/>
       </w:pPr>
       <w:r>
-        <w:t>Technical Skills</w:t>
+        <w:t>TECHNICAL SKILLS</w:t>
       </w:r>
     </w:p>
     <w:p>
@@ -398,7 +529,7 @@
         <w:pStyle w:val="Heading1"/>
       </w:pPr>
       <w:r>
-        <w:t>Education and Professional Development</w:t>
+        <w:t>EDUCATION AND PROFESSIONAL DEVELOPMENT</w:t>
       </w:r>
     </w:p>
     <w:p>
@@ -417,9 +548,9 @@
       </w:r>
     </w:p>
     <w:sectPr>
-      <w:footerReference w:type="default" r:id="rId9"/>
+      <w:footerReference w:type="default" r:id="rId11"/>
       <w:pgSz w:w="12240" w:h="15840"/>
-      <w:pgMar w:top="835" w:right="936" w:bottom="792" w:left="936" w:header="720" w:footer="720" w:gutter="0"/>
+      <w:pgMar w:top="864" w:right="936" w:bottom="792" w:left="936" w:header="360" w:footer="360" w:gutter="0"/>
       <w:cols w:space="720"/>
       <w:docGrid w:linePitch="360"/>
     </w:sectPr>
@@ -436,7 +567,8 @@
     </w:pPr>
     <w:r>
       <w:rPr>
-        <w:color w:val="5A5A5A"/>
+        <w:rFonts w:ascii="Arial" w:hAnsi="Arial"/>
+        <w:color w:val="555555"/>
         <w:sz w:val="16"/>
       </w:rPr>
       <w:t xml:space="preserve">Hari Simran Khalsa  |  </w:t>
@@ -645,6 +777,20 @@
   </w:num>
   <w:num w:numId="9">
     <w:abstractNumId w:val="0"/>
+  </w:num>
+  <w:abstractNum w:abstractNumId="40">
+    <w:lvl w:ilvl="0">
+      <w:start w:val="1"/>
+      <w:numFmt w:val="bullet"/>
+      <w:lvlText w:val="•"/>
+      <w:lvlJc w:val="left"/>
+      <w:pPr>
+        <w:ind w:left="200" w:hanging="200"/>
+      </w:pPr>
+    </w:lvl>
+  </w:abstractNum>
+  <w:num w:numId="40">
+    <w:abstractNumId w:val="40"/>
   </w:num>
 </w:numbering>
 </file>
@@ -810,10 +956,11 @@
     <w:qFormat/>
     <w:rsid w:val="00FC693F"/>
     <w:pPr>
-      <w:spacing w:after="80" w:line="252" w:lineRule="auto"/>
+      <w:widowControl/>
+      <w:spacing w:line="250" w:lineRule="auto" w:after="60"/>
     </w:pPr>
     <w:rPr>
-      <w:rFonts w:ascii="Calibri" w:hAnsi="Calibri"/>
+      <w:rFonts w:ascii="Arial" w:hAnsi="Arial"/>
       <w:color w:val="000000"/>
       <w:sz w:val="21"/>
     </w:rPr>
@@ -873,15 +1020,16 @@
     <w:pPr>
       <w:keepNext/>
       <w:keepLines/>
-      <w:spacing w:before="200" w:after="80"/>
+      <w:widowControl/>
+      <w:spacing w:before="220" w:after="100" w:line="240" w:lineRule="auto"/>
       <w:outlineLvl w:val="0"/>
     </w:pPr>
     <w:rPr>
-      <w:rFonts w:asciiTheme="majorHAnsi" w:eastAsiaTheme="majorEastAsia" w:hAnsiTheme="majorHAnsi" w:cstheme="majorBidi" w:ascii="Calibri" w:hAnsi="Calibri"/>
+      <w:rFonts w:asciiTheme="majorHAnsi" w:eastAsiaTheme="majorEastAsia" w:hAnsiTheme="majorHAnsi" w:cstheme="majorBidi" w:ascii="Arial" w:hAnsi="Arial"/>
       <w:b/>
       <w:bCs/>
       <w:color w:val="000000"/>
-      <w:sz w:val="23"/>
+      <w:sz w:val="22"/>
       <w:szCs w:val="28"/>
     </w:rPr>
   </w:style>
@@ -897,11 +1045,12 @@
     <w:pPr>
       <w:keepNext/>
       <w:keepLines/>
-      <w:spacing w:before="140" w:after="80"/>
+      <w:widowControl/>
+      <w:spacing w:before="140" w:after="40" w:line="240" w:lineRule="auto"/>
       <w:outlineLvl w:val="1"/>
     </w:pPr>
     <w:rPr>
-      <w:rFonts w:asciiTheme="majorHAnsi" w:eastAsiaTheme="majorEastAsia" w:hAnsiTheme="majorHAnsi" w:cstheme="majorBidi" w:ascii="Calibri" w:hAnsi="Calibri"/>
+      <w:rFonts w:asciiTheme="majorHAnsi" w:eastAsiaTheme="majorEastAsia" w:hAnsiTheme="majorHAnsi" w:cstheme="majorBidi" w:ascii="Arial" w:hAnsi="Arial"/>
       <w:b/>
       <w:bCs/>
       <w:color w:val="000000"/>
@@ -1159,16 +1308,18 @@
     <w:qFormat/>
     <w:rsid w:val="00FC693F"/>
     <w:pPr>
-      <w:spacing w:after="60" w:line="240" w:lineRule="auto"/>
+      <w:keepNext/>
+      <w:widowControl/>
+      <w:spacing w:after="60" w:line="240" w:lineRule="auto" w:before="0"/>
       <w:contextualSpacing/>
     </w:pPr>
     <w:rPr>
-      <w:rFonts w:asciiTheme="majorHAnsi" w:eastAsiaTheme="majorEastAsia" w:hAnsiTheme="majorHAnsi" w:cstheme="majorBidi" w:ascii="Calibri" w:hAnsi="Calibri"/>
+      <w:rFonts w:asciiTheme="majorHAnsi" w:eastAsiaTheme="majorEastAsia" w:hAnsiTheme="majorHAnsi" w:cstheme="majorBidi" w:ascii="Arial" w:hAnsi="Arial"/>
       <w:b/>
       <w:color w:val="000000"/>
       <w:spacing w:val="5"/>
       <w:kern w:val="28"/>
-      <w:sz w:val="50"/>
+      <w:sz w:val="46"/>
       <w:szCs w:val="52"/>
     </w:rPr>
   </w:style>
@@ -1196,15 +1347,16 @@
     <w:qFormat/>
     <w:rsid w:val="00FC693F"/>
     <w:pPr>
+      <w:widowControl/>
       <w:numPr>
         <w:ilvl w:val="1"/>
       </w:numPr>
     </w:pPr>
     <w:rPr>
-      <w:rFonts w:asciiTheme="majorHAnsi" w:eastAsiaTheme="majorEastAsia" w:hAnsiTheme="majorHAnsi" w:cstheme="majorBidi"/>
+      <w:rFonts w:asciiTheme="majorHAnsi" w:eastAsiaTheme="majorEastAsia" w:hAnsiTheme="majorHAnsi" w:cstheme="majorBidi" w:ascii="Arial" w:hAnsi="Arial"/>
       <w:i/>
       <w:iCs/>
-      <w:color w:val="4F81BD" w:themeColor="accent1"/>
+      <w:color w:val="000000"/>
       <w:spacing w:val="15"/>
       <w:sz w:val="24"/>
       <w:szCs w:val="24"/>
@@ -1339,16 +1491,18 @@
     <w:unhideWhenUsed/>
     <w:rsid w:val="00326F90"/>
     <w:pPr>
+      <w:widowControl/>
       <w:numPr>
         <w:numId w:val="1"/>
       </w:numPr>
-      <w:spacing w:after="60"/>
-      <w:ind w:left="202" w:hanging="173"/>
+      <w:spacing w:after="60" w:line="250" w:lineRule="auto"/>
+      <w:ind w:left="202" w:hanging="202"/>
       <w:contextualSpacing/>
     </w:pPr>
     <w:rPr>
-      <w:rFonts w:ascii="Calibri" w:hAnsi="Calibri"/>
+      <w:rFonts w:ascii="Arial" w:hAnsi="Arial"/>
       <w:color w:val="000000"/>
+      <w:sz w:val="21"/>
     </w:rPr>
   </w:style>
   <w:style w:type="paragraph" w:styleId="ListBullet2">

</xml_diff>

<commit_message>
Expand career experience and document SFS Schneider Kroger implementation contract
</commit_message>
<xml_diff>
--- a/Hari_Simran_Khalsa_Operations_Resume.docx
+++ b/Hari_Simran_Khalsa_Operations_Resume.docx
@@ -246,7 +246,7 @@
         <w:rPr>
           <w:i/>
         </w:rPr>
-        <w:t>Transportation Planning and Dispatch</w:t>
+        <w:t>Implementation Team · Transportation Planning and Dispatch</w:t>
       </w:r>
     </w:p>
     <w:p>
@@ -258,7 +258,31 @@
         </w:numPr>
       </w:pPr>
       <w:r>
-        <w:t>Coordinated fleet dispatch, transportation scheduling, shipment tracking, and operational reporting; resolved scheduling conflicts and maintained transportation documentation.</w:t>
+        <w:t>Completed a one-month contract through Security Flaw Solutions (SFS) on the implementation team launching Schneider’s new Kroger account.</w:t>
+      </w:r>
+    </w:p>
+    <w:p>
+      <w:pPr>
+        <w:pStyle w:val="ListBullet"/>
+        <w:numPr>
+          <w:ilvl w:val="0"/>
+          <w:numId w:val="40"/>
+        </w:numPr>
+      </w:pPr>
+      <w:r>
+        <w:t>Helped establish operations for critical food shipments as the team began supporting the new account.</w:t>
+      </w:r>
+    </w:p>
+    <w:p>
+      <w:pPr>
+        <w:pStyle w:val="ListBullet"/>
+        <w:numPr>
+          <w:ilvl w:val="0"/>
+          <w:numId w:val="40"/>
+        </w:numPr>
+      </w:pPr>
+      <w:r>
+        <w:t>Coordinated dispatch, transportation scheduling, and shipment tracking; resolved scheduling conflicts and maintained operational reports and transportation documentation.</w:t>
       </w:r>
     </w:p>
     <w:p>

</xml_diff>

<commit_message>
Highlight leadership and operations skills across portfolio and resume
</commit_message>
<xml_diff>
--- a/Hari_Simran_Khalsa_Operations_Resume.docx
+++ b/Hari_Simran_Khalsa_Operations_Resume.docx
@@ -68,12 +68,40 @@
         <w:pStyle w:val="Heading1"/>
       </w:pPr>
       <w:r>
-        <w:t>CORE CAPABILITIES</w:t>
+        <w:t>LEADERSHIP, OPERATIONS AND TECHNICAL SKILLS</w:t>
       </w:r>
     </w:p>
     <w:p>
       <w:r>
-        <w:t>Workforce planning and development | Transportation and route planning | Continuous improvement | Quality and service KPIs | TMS and WMS workflows | Power BI | Operational reporting | AI-augmented full-stack development | Cross-functional coordination</w:t>
+        <w:rPr>
+          <w:b/>
+        </w:rPr>
+        <w:t xml:space="preserve">Leadership: </w:t>
+      </w:r>
+      <w:r>
+        <w:t>Team leadership | Frontline coaching | Employee development | Cross-functional coordination</w:t>
+      </w:r>
+    </w:p>
+    <w:p>
+      <w:r>
+        <w:rPr>
+          <w:b/>
+        </w:rPr>
+        <w:t xml:space="preserve">Operations: </w:t>
+      </w:r>
+      <w:r>
+        <w:t>Workforce planning | Dispatch and transportation planning | Process improvement | Quality and service KPIs | Operational recovery</w:t>
+      </w:r>
+    </w:p>
+    <w:p>
+      <w:r>
+        <w:rPr>
+          <w:b/>
+        </w:rPr>
+        <w:t xml:space="preserve">Technology: </w:t>
+      </w:r>
+      <w:r>
+        <w:t>TMS/WMS | Blue Yonder | Excel | Power BI | Python | SQL | AI-assisted software development | FastAPI | PostgreSQL | Streamlit | AWS | Docker</w:t>
       </w:r>
     </w:p>
     <w:p>
@@ -540,19 +568,6 @@
         <w:pStyle w:val="Heading1"/>
       </w:pPr>
       <w:r>
-        <w:t>TECHNICAL SKILLS</w:t>
-      </w:r>
-    </w:p>
-    <w:p>
-      <w:r>
-        <w:t>TMS/WMS workflows | Blue Yonder staffing and attendance | Microsoft Excel | Power BI | AI-augmented full-stack development | Python | SQL | FastAPI | PostgreSQL | Streamlit | AWS | Docker</w:t>
-      </w:r>
-    </w:p>
-    <w:p>
-      <w:pPr>
-        <w:pStyle w:val="Heading1"/>
-      </w:pPr>
-      <w:r>
         <w:t>EDUCATION AND PROFESSIONAL DEVELOPMENT</w:t>
       </w:r>
     </w:p>

</xml_diff>

<commit_message>
Publish phone-redacted HR résumé and restore portfolio downloads
</commit_message>
<xml_diff>
--- a/Hari_Simran_Khalsa_Operations_Resume.docx
+++ b/Hari_Simran_Khalsa_Operations_Resume.docx
@@ -4,592 +4,900 @@
   <w:body>
     <w:p>
       <w:pPr>
-        <w:pStyle w:val="Title"/>
+        <w:spacing w:after="20"/>
+        <w:jc w:val="center"/>
       </w:pPr>
       <w:r>
+        <w:rPr>
+          <w:rFonts w:ascii="Aptos Display" w:hAnsi="Aptos Display"/>
+          <w:b/>
+          <w:color w:val="1F374E"/>
+          <w:sz w:val="40"/>
+        </w:rPr>
         <w:t>HARI SIMRAN KHALSA</w:t>
       </w:r>
     </w:p>
     <w:p>
+      <w:pPr>
+        <w:spacing w:after="40"/>
+        <w:jc w:val="center"/>
+      </w:pPr>
       <w:r>
-        <w:t xml:space="preserve">Dublin, Ohio  |  </w:t>
+        <w:rPr>
+          <w:rFonts w:ascii="Aptos" w:hAnsi="Aptos"/>
+          <w:b/>
+          <w:color w:val="5F5F5F"/>
+          <w:sz w:val="18"/>
+        </w:rPr>
+        <w:t>OPERATIONS LEADERSHIP | PROCESS IMPROVEMENT | LOGISTICS TECHNOLOGY</w:t>
+      </w:r>
+    </w:p>
+    <w:p>
+      <w:pPr>
+        <w:spacing w:after="100"/>
+        <w:jc w:val="center"/>
+      </w:pPr>
+      <w:r>
+        <w:rPr>
+          <w:rFonts w:ascii="Aptos" w:hAnsi="Aptos"/>
+          <w:color w:val="232323"/>
+          <w:sz w:val="18"/>
+        </w:rPr>
+        <w:t>Dublin, Ohio</w:t>
+      </w:r>
+      <w:r>
+        <w:t xml:space="preserve">  |  </w:t>
+      </w:r>
+      <w:r>
+        <w:rPr>
+          <w:rFonts w:ascii="Aptos" w:hAnsi="Aptos"/>
+          <w:color w:val="232323"/>
+          <w:sz w:val="18"/>
+        </w:rPr>
+      </w:r>
+      <w:r/>
+      <w:r>
+        <w:rPr>
+          <w:rFonts w:ascii="Aptos" w:hAnsi="Aptos"/>
+          <w:color w:val="232323"/>
+          <w:sz w:val="18"/>
+        </w:rPr>
+        <w:t>hkhalsa095@gmail.com</w:t>
+      </w:r>
+      <w:r>
+        <w:t xml:space="preserve">  |  </w:t>
       </w:r>
       <w:hyperlink r:id="rId9">
         <w:r>
           <w:rPr>
-            <w:color w:val="214EAC"/>
+            <w:color w:val="1F4E79"/>
             <w:u w:val="single"/>
+            <w:rFonts w:ascii="Aptos" w:hAnsi="Aptos"/>
+            <w:sz w:val="19"/>
           </w:rPr>
-          <w:t>hkhalsa095@gmail.com</w:t>
+          <w:t>Portfolio Website</w:t>
         </w:r>
       </w:hyperlink>
     </w:p>
     <w:p>
       <w:pPr>
-        <w:spacing w:after="140"/>
+        <w:keepNext/>
+        <w:spacing w:before="140" w:after="60"/>
+        <w:pBdr>
+          <w:bottom w:val="single" w:sz="8" w:space="2" w:color="B7C5D1"/>
+        </w:pBdr>
       </w:pPr>
       <w:r>
-        <w:t xml:space="preserve">Portfolio: </w:t>
-      </w:r>
-      <w:hyperlink r:id="rId10">
-        <w:r>
-          <w:rPr>
-            <w:color w:val="214EAC"/>
-            <w:u w:val="single"/>
-          </w:rPr>
-          <w:t>sfskhalsa101.github.io/hari-simran-khalsa-portfolio</w:t>
-        </w:r>
-      </w:hyperlink>
-    </w:p>
-    <w:p>
-      <w:r>
         <w:rPr>
+          <w:rFonts w:ascii="Aptos" w:hAnsi="Aptos"/>
           <w:b/>
+          <w:color w:val="1F374E"/>
           <w:sz w:val="20"/>
         </w:rPr>
-        <w:t>OPERATIONS LEADERSHIP AND PROCESS IMPROVEMENT</w:t>
+        <w:t>PROFESSIONAL PROFILE</w:t>
       </w:r>
     </w:p>
     <w:p>
       <w:pPr>
-        <w:pStyle w:val="Heading1"/>
+        <w:spacing w:after="60" w:line="247" w:lineRule="auto"/>
       </w:pPr>
       <w:r>
-        <w:t>PROFESSIONAL SUMMARY</w:t>
-      </w:r>
-    </w:p>
-    <w:p>
-      <w:r>
-        <w:t>Operations leader with 5+ years of experience across package distribution, dispatch, transportation planning, and manufacturing logistics. Led teams of 70+ employees, reduced daily misloads by more than 90%, and delivered approximately $86,000 in estimated annual dispatch savings. Misload reduction represents approximately $1.17 million in annualized cost avoidance at $50 per misload and 260 operating days. Combines frontline leadership and process improvement with experience building, deploying, and selling an operational reporting application.</w:t>
+        <w:rPr>
+          <w:rFonts w:ascii="Aptos" w:hAnsi="Aptos"/>
+          <w:color w:val="232323"/>
+          <w:sz w:val="18"/>
+        </w:rPr>
+        <w:t>Operations and logistics leader with 5+ years of experience across parcel distribution, dispatch, transportation planning, manufacturing logistics, and operational technology. Entered FedEx with prior experience leading teams of 70+, delivering measurable cost and quality improvements, managing transportation operations, and building/deploying operational software. Combines frontline leadership with continuous-improvement discipline, data tools, and systems fluency.</w:t>
       </w:r>
     </w:p>
     <w:p>
       <w:pPr>
-        <w:pStyle w:val="Heading1"/>
+        <w:keepNext/>
+        <w:spacing w:before="140" w:after="60"/>
+        <w:pBdr>
+          <w:bottom w:val="single" w:sz="8" w:space="2" w:color="B7C5D1"/>
+        </w:pBdr>
       </w:pPr>
       <w:r>
-        <w:t>LEADERSHIP, OPERATIONS AND TECHNICAL SKILLS</w:t>
+        <w:rPr>
+          <w:rFonts w:ascii="Aptos" w:hAnsi="Aptos"/>
+          <w:b/>
+          <w:color w:val="1F374E"/>
+          <w:sz w:val="20"/>
+        </w:rPr>
+        <w:t>PRE-HIRE EXPERIENCE &amp; QUANTIFIED IMPACT</w:t>
       </w:r>
     </w:p>
+    <w:tbl>
+      <w:tblPr>
+        <w:tblW w:type="auto" w:w="0"/>
+        <w:jc w:val="center"/>
+        <w:tblLayout w:type="fixed"/>
+        <w:tblLook w:firstColumn="1" w:firstRow="1" w:lastColumn="0" w:lastRow="0" w:noHBand="0" w:noVBand="1" w:val="04A0"/>
+      </w:tblPr>
+      <w:tblGrid>
+        <w:gridCol w:w="5328"/>
+        <w:gridCol w:w="5328"/>
+      </w:tblGrid>
+      <w:tr>
+        <w:trPr>
+          <w:cantSplit/>
+        </w:trPr>
+        <w:tc>
+          <w:tcPr>
+            <w:tcW w:type="dxa" w:w="5112"/>
+            <w:shd w:fill="F3F6F8"/>
+            <w:tcMar>
+              <w:top w:w="70" w:type="dxa"/>
+              <w:start w:w="110" w:type="dxa"/>
+              <w:bottom w:w="70" w:type="dxa"/>
+              <w:end w:w="110" w:type="dxa"/>
+            </w:tcMar>
+            <w:vAlign w:val="top"/>
+          </w:tcPr>
+          <w:p>
+            <w:pPr>
+              <w:spacing w:after="20"/>
+            </w:pPr>
+            <w:r>
+              <w:rPr>
+                <w:rFonts w:ascii="Aptos" w:hAnsi="Aptos"/>
+                <w:b/>
+                <w:color w:val="1F374E"/>
+                <w:sz w:val="16"/>
+              </w:rPr>
+              <w:t>PARCEL OPERATIONS</w:t>
+            </w:r>
+          </w:p>
+          <w:p>
+            <w:pPr>
+              <w:spacing w:after="0" w:line="240" w:lineRule="auto"/>
+            </w:pPr>
+            <w:r>
+              <w:rPr>
+                <w:rFonts w:ascii="Aptos" w:hAnsi="Aptos"/>
+                <w:color w:val="232323"/>
+                <w:sz w:val="17"/>
+              </w:rPr>
+              <w:t>Led 70+ employees at UPS; reduced daily misloads from ~100 to &lt;10 in three months (&gt;90%), representing ~$1.17M annualized cost avoidance at $50 per misload and 260 operating days.</w:t>
+            </w:r>
+          </w:p>
+        </w:tc>
+        <w:tc>
+          <w:tcPr>
+            <w:tcW w:type="dxa" w:w="5112"/>
+            <w:shd w:fill="F3F6F8"/>
+            <w:tcMar>
+              <w:top w:w="70" w:type="dxa"/>
+              <w:start w:w="110" w:type="dxa"/>
+              <w:bottom w:w="70" w:type="dxa"/>
+              <w:end w:w="110" w:type="dxa"/>
+            </w:tcMar>
+            <w:vAlign w:val="top"/>
+          </w:tcPr>
+          <w:p>
+            <w:pPr>
+              <w:spacing w:after="20"/>
+            </w:pPr>
+            <w:r>
+              <w:rPr>
+                <w:rFonts w:ascii="Aptos" w:hAnsi="Aptos"/>
+                <w:b/>
+                <w:color w:val="1F374E"/>
+                <w:sz w:val="16"/>
+              </w:rPr>
+              <w:t>DISPATCH &amp; LABOR</w:t>
+            </w:r>
+          </w:p>
+          <w:p>
+            <w:pPr>
+              <w:spacing w:after="0" w:line="240" w:lineRule="auto"/>
+            </w:pPr>
+            <w:r>
+              <w:rPr>
+                <w:rFonts w:ascii="Aptos" w:hAnsi="Aptos"/>
+                <w:color w:val="232323"/>
+                <w:sz w:val="17"/>
+              </w:rPr>
+              <w:t>Coordinated 70 drivers; generated ~$86K in estimated annual logistics savings through route/workflow optimization and reduced overtime 20% through workforce balancing.</w:t>
+            </w:r>
+          </w:p>
+        </w:tc>
+      </w:tr>
+      <w:tr>
+        <w:trPr>
+          <w:cantSplit/>
+        </w:trPr>
+        <w:tc>
+          <w:tcPr>
+            <w:tcW w:type="dxa" w:w="5112"/>
+            <w:shd w:fill="F3F6F8"/>
+            <w:tcMar>
+              <w:top w:w="70" w:type="dxa"/>
+              <w:start w:w="110" w:type="dxa"/>
+              <w:bottom w:w="70" w:type="dxa"/>
+              <w:end w:w="110" w:type="dxa"/>
+            </w:tcMar>
+            <w:vAlign w:val="top"/>
+          </w:tcPr>
+          <w:p>
+            <w:pPr>
+              <w:spacing w:after="20"/>
+            </w:pPr>
+            <w:r>
+              <w:rPr>
+                <w:rFonts w:ascii="Aptos" w:hAnsi="Aptos"/>
+                <w:b/>
+                <w:color w:val="1F374E"/>
+                <w:sz w:val="16"/>
+              </w:rPr>
+              <w:t>MANUFACTURING LOGISTICS</w:t>
+            </w:r>
+          </w:p>
+          <w:p>
+            <w:pPr>
+              <w:spacing w:after="0" w:line="240" w:lineRule="auto"/>
+            </w:pPr>
+            <w:r>
+              <w:rPr>
+                <w:rFonts w:ascii="Aptos" w:hAnsi="Aptos"/>
+                <w:color w:val="232323"/>
+                <w:sz w:val="17"/>
+              </w:rPr>
+              <w:t>Maintained zero shipping and quality errors over three months at Hidaka USA and implemented workflow improvements producing ~$2K in weekly savings.</w:t>
+            </w:r>
+          </w:p>
+        </w:tc>
+        <w:tc>
+          <w:tcPr>
+            <w:tcW w:type="dxa" w:w="5112"/>
+            <w:shd w:fill="F3F6F8"/>
+            <w:tcMar>
+              <w:top w:w="70" w:type="dxa"/>
+              <w:start w:w="110" w:type="dxa"/>
+              <w:bottom w:w="70" w:type="dxa"/>
+              <w:end w:w="110" w:type="dxa"/>
+            </w:tcMar>
+            <w:vAlign w:val="top"/>
+          </w:tcPr>
+          <w:p>
+            <w:pPr>
+              <w:spacing w:after="20"/>
+            </w:pPr>
+            <w:r>
+              <w:rPr>
+                <w:rFonts w:ascii="Aptos" w:hAnsi="Aptos"/>
+                <w:b/>
+                <w:color w:val="1F374E"/>
+                <w:sz w:val="16"/>
+              </w:rPr>
+              <w:t>TECHNICAL DELIVERY</w:t>
+            </w:r>
+          </w:p>
+          <w:p>
+            <w:pPr>
+              <w:spacing w:after="0" w:line="240" w:lineRule="auto"/>
+            </w:pPr>
+            <w:r>
+              <w:rPr>
+                <w:rFonts w:ascii="Aptos" w:hAnsi="Aptos"/>
+                <w:color w:val="232323"/>
+                <w:sz w:val="17"/>
+              </w:rPr>
+              <w:t>Built, deployed, and sold AIncident, an operational reporting application, for $5K; experience with Power BI, SQL, Python, AWS, Docker, PostgreSQL, and TMS/WMS workflows.</w:t>
+            </w:r>
+          </w:p>
+        </w:tc>
+      </w:tr>
+    </w:tbl>
     <w:p>
+      <w:pPr>
+        <w:keepNext/>
+        <w:spacing w:before="140" w:after="60"/>
+        <w:pBdr>
+          <w:bottom w:val="single" w:sz="8" w:space="2" w:color="B7C5D1"/>
+        </w:pBdr>
+      </w:pPr>
       <w:r>
         <w:rPr>
+          <w:rFonts w:ascii="Aptos" w:hAnsi="Aptos"/>
           <w:b/>
+          <w:color w:val="1F374E"/>
+          <w:sz w:val="20"/>
         </w:rPr>
-        <w:t xml:space="preserve">Leadership: </w:t>
-      </w:r>
-      <w:r>
-        <w:t>Team leadership | Frontline coaching | Employee development | Cross-functional coordination</w:t>
-      </w:r>
-    </w:p>
-    <w:p>
-      <w:r>
-        <w:rPr>
-          <w:b/>
-        </w:rPr>
-        <w:t xml:space="preserve">Operations: </w:t>
-      </w:r>
-      <w:r>
-        <w:t>Workforce planning | Dispatch and transportation planning | Process improvement | Quality and service KPIs | Operational recovery</w:t>
-      </w:r>
-    </w:p>
-    <w:p>
-      <w:r>
-        <w:rPr>
-          <w:b/>
-        </w:rPr>
-        <w:t xml:space="preserve">Technology: </w:t>
-      </w:r>
-      <w:r>
-        <w:t>TMS/WMS | Blue Yonder | Excel | Power BI | Python | SQL | AI-assisted software development | FastAPI | PostgreSQL | Streamlit | AWS | Docker</w:t>
+        <w:t>CORE CAPABILITIES</w:t>
       </w:r>
     </w:p>
     <w:p>
       <w:pPr>
-        <w:pStyle w:val="Heading1"/>
+        <w:spacing w:after="40"/>
       </w:pPr>
       <w:r>
+        <w:rPr>
+          <w:rFonts w:ascii="Aptos" w:hAnsi="Aptos"/>
+          <w:color w:val="232323"/>
+          <w:sz w:val="17"/>
+        </w:rPr>
+        <w:t>Workforce Planning &amp; Development | Parcel Operations | Transportation &amp; Route Planning | Continuous Improvement | Quality &amp; Service KPIs | TMS/WMS Workflows | Blue Yonder | Power BI | SQL | Operational Reporting | AI-Augmented Full-Stack Development</w:t>
+      </w:r>
+    </w:p>
+    <w:p>
+      <w:pPr>
+        <w:keepNext/>
+        <w:spacing w:before="140" w:after="60"/>
+        <w:pBdr>
+          <w:bottom w:val="single" w:sz="8" w:space="2" w:color="B7C5D1"/>
+        </w:pBdr>
+      </w:pPr>
+      <w:r>
+        <w:rPr>
+          <w:rFonts w:ascii="Aptos" w:hAnsi="Aptos"/>
+          <w:b/>
+          <w:color w:val="1F374E"/>
+          <w:sz w:val="20"/>
+        </w:rPr>
         <w:t>PROFESSIONAL EXPERIENCE</w:t>
       </w:r>
     </w:p>
     <w:p>
       <w:pPr>
-        <w:pStyle w:val="Heading2"/>
-        <w:tabs>
-          <w:tab w:pos="10368" w:val="right"/>
-        </w:tabs>
+        <w:keepNext/>
+        <w:spacing w:before="56" w:after="10"/>
       </w:pPr>
       <w:r>
+        <w:rPr>
+          <w:rFonts w:ascii="Aptos" w:hAnsi="Aptos"/>
+          <w:b/>
+          <w:color w:val="232323"/>
+          <w:sz w:val="19"/>
+        </w:rPr>
         <w:t>FedEx</w:t>
       </w:r>
       <w:r>
         <w:rPr>
-          <w:b w:val="0"/>
+          <w:rFonts w:ascii="Aptos" w:hAnsi="Aptos"/>
+          <w:b/>
+          <w:color w:val="1F374E"/>
           <w:sz w:val="19"/>
         </w:rPr>
-        <w:tab/>
-        <w:t>June 2026 – Present</w:t>
+        <w:t xml:space="preserve"> | Operations Supervisor</w:t>
+      </w:r>
+      <w:r>
+        <w:rPr>
+          <w:rFonts w:ascii="Aptos" w:hAnsi="Aptos"/>
+          <w:color w:val="5F5F5F"/>
+          <w:sz w:val="18"/>
+        </w:rPr>
+        <w:t xml:space="preserve">   June 2026 - Present</w:t>
+      </w:r>
+      <w:r>
+        <w:rPr>
+          <w:rFonts w:ascii="Aptos" w:hAnsi="Aptos"/>
+          <w:color w:val="5F5F5F"/>
+          <w:sz w:val="18"/>
+        </w:rPr>
+        <w:t xml:space="preserve"> | Plain City, Ohio</w:t>
+      </w:r>
+    </w:p>
+    <w:p>
+      <w:pPr>
+        <w:pStyle w:val="ListBullet"/>
+        <w:spacing w:after="23" w:line="245" w:lineRule="auto"/>
+        <w:ind w:left="259" w:hanging="187"/>
+      </w:pPr>
+      <w:r>
+        <w:rPr>
+          <w:rFonts w:ascii="Aptos" w:hAnsi="Aptos"/>
+          <w:color w:val="232323"/>
+          <w:sz w:val="18"/>
+        </w:rPr>
+        <w:t>Lead staffing, package-flow execution, frontline coaching, quality coordination, and operational recovery in a high-volume parcel facility; use Blue Yonder for attendance and staffing workflows.</w:t>
       </w:r>
     </w:p>
     <w:p>
       <w:pPr>
         <w:keepNext/>
-        <w:spacing w:after="80"/>
+        <w:spacing w:before="56" w:after="10"/>
       </w:pPr>
       <w:r>
         <w:rPr>
-          <w:i/>
+          <w:rFonts w:ascii="Aptos" w:hAnsi="Aptos"/>
+          <w:b/>
+          <w:color w:val="232323"/>
+          <w:sz w:val="19"/>
         </w:rPr>
-        <w:t>Operations Supervisor · Plain City, Ohio</w:t>
+        <w:t>Hidaka USA</w:t>
+      </w:r>
+      <w:r>
+        <w:rPr>
+          <w:rFonts w:ascii="Aptos" w:hAnsi="Aptos"/>
+          <w:b/>
+          <w:color w:val="1F374E"/>
+          <w:sz w:val="19"/>
+        </w:rPr>
+        <w:t xml:space="preserve"> | TMS/WMS Specialist and Shipping Associate</w:t>
+      </w:r>
+      <w:r>
+        <w:rPr>
+          <w:rFonts w:ascii="Aptos" w:hAnsi="Aptos"/>
+          <w:color w:val="5F5F5F"/>
+          <w:sz w:val="18"/>
+        </w:rPr>
+        <w:t xml:space="preserve">   2026</w:t>
       </w:r>
     </w:p>
     <w:p>
       <w:pPr>
         <w:pStyle w:val="ListBullet"/>
-        <w:numPr>
-          <w:ilvl w:val="0"/>
-          <w:numId w:val="40"/>
-        </w:numPr>
+        <w:spacing w:after="23" w:line="245" w:lineRule="auto"/>
+        <w:ind w:left="259" w:hanging="187"/>
       </w:pPr>
       <w:r>
-        <w:t>Lead staffing, package-flow execution, frontline coaching, quality coordination, and operational recovery in a high-volume parcel facility; use Blue Yonder for attendance and staffing workflows.</w:t>
+        <w:rPr>
+          <w:rFonts w:ascii="Aptos" w:hAnsi="Aptos"/>
+          <w:color w:val="232323"/>
+          <w:sz w:val="18"/>
+        </w:rPr>
+        <w:t>Supported outbound freight, receiving, inventory movement, production coordination, and transportation/warehouse systems in a manufacturing environment.</w:t>
       </w:r>
     </w:p>
     <w:p>
       <w:pPr>
         <w:pStyle w:val="ListBullet"/>
-        <w:numPr>
-          <w:ilvl w:val="0"/>
-          <w:numId w:val="40"/>
-        </w:numPr>
+        <w:spacing w:after="23" w:line="245" w:lineRule="auto"/>
+        <w:ind w:left="259" w:hanging="187"/>
       </w:pPr>
       <w:r>
-        <w:t>Covered unload and two load areas during a shift processing 73,000 packages, coordinating 40 people in unload and 28 across the load areas.</w:t>
+        <w:rPr>
+          <w:rFonts w:ascii="Aptos" w:hAnsi="Aptos"/>
+          <w:color w:val="232323"/>
+          <w:sz w:val="18"/>
+        </w:rPr>
+        <w:t>Maintained zero shipping and quality errors over three months; implemented workflow improvements producing approximately $2,000 in weekly savings.</w:t>
+      </w:r>
+    </w:p>
+    <w:p>
+      <w:pPr>
+        <w:keepNext/>
+        <w:spacing w:before="56" w:after="10"/>
+      </w:pPr>
+      <w:r>
+        <w:rPr>
+          <w:rFonts w:ascii="Aptos" w:hAnsi="Aptos"/>
+          <w:b/>
+          <w:color w:val="232323"/>
+          <w:sz w:val="19"/>
+        </w:rPr>
+        <w:t>Schneider</w:t>
+      </w:r>
+      <w:r>
+        <w:rPr>
+          <w:rFonts w:ascii="Aptos" w:hAnsi="Aptos"/>
+          <w:b/>
+          <w:color w:val="1F374E"/>
+          <w:sz w:val="19"/>
+        </w:rPr>
+        <w:t xml:space="preserve"> | Transportation Planning and Dispatch</w:t>
+      </w:r>
+      <w:r>
+        <w:rPr>
+          <w:rFonts w:ascii="Aptos" w:hAnsi="Aptos"/>
+          <w:color w:val="5F5F5F"/>
+          <w:sz w:val="18"/>
+        </w:rPr>
+        <w:t xml:space="preserve">   2025</w:t>
       </w:r>
     </w:p>
     <w:p>
       <w:pPr>
         <w:pStyle w:val="ListBullet"/>
-        <w:numPr>
-          <w:ilvl w:val="0"/>
-          <w:numId w:val="40"/>
-        </w:numPr>
+        <w:spacing w:after="23" w:line="245" w:lineRule="auto"/>
+        <w:ind w:left="259" w:hanging="187"/>
       </w:pPr>
       <w:r>
-        <w:t>Achieved peak unload throughput of 17,000 packages per hour before a sorter interruption during that shift.</w:t>
+        <w:rPr>
+          <w:rFonts w:ascii="Aptos" w:hAnsi="Aptos"/>
+          <w:color w:val="232323"/>
+          <w:sz w:val="18"/>
+        </w:rPr>
+        <w:t>Coordinated fleet dispatch, transportation scheduling, shipment tracking, and operational reporting; resolved scheduling conflicts and maintained transportation documentation.</w:t>
+      </w:r>
+    </w:p>
+    <w:p>
+      <w:pPr>
+        <w:keepNext/>
+        <w:spacing w:before="56" w:after="10"/>
+      </w:pPr>
+      <w:r>
+        <w:rPr>
+          <w:rFonts w:ascii="Aptos" w:hAnsi="Aptos"/>
+          <w:b/>
+          <w:color w:val="232323"/>
+          <w:sz w:val="19"/>
+        </w:rPr>
+        <w:t>Target</w:t>
+      </w:r>
+      <w:r>
+        <w:rPr>
+          <w:rFonts w:ascii="Aptos" w:hAnsi="Aptos"/>
+          <w:b/>
+          <w:color w:val="1F374E"/>
+          <w:sz w:val="19"/>
+        </w:rPr>
+        <w:t xml:space="preserve"> | Security Specialist, Asset Protection</w:t>
+      </w:r>
+      <w:r>
+        <w:rPr>
+          <w:rFonts w:ascii="Aptos" w:hAnsi="Aptos"/>
+          <w:color w:val="5F5F5F"/>
+          <w:sz w:val="18"/>
+        </w:rPr>
+        <w:t xml:space="preserve">   2024 - 2025</w:t>
       </w:r>
     </w:p>
     <w:p>
       <w:pPr>
         <w:pStyle w:val="ListBullet"/>
-        <w:numPr>
-          <w:ilvl w:val="0"/>
-          <w:numId w:val="40"/>
-        </w:numPr>
+        <w:spacing w:after="23" w:line="245" w:lineRule="auto"/>
+        <w:ind w:left="259" w:hanging="187"/>
       </w:pPr>
       <w:r>
-        <w:t>Develop trainers to run their areas, coordinate quality issues with support teams, and provide new supervisors with work methods, standards, and documentation resources.</w:t>
+        <w:rPr>
+          <w:rFonts w:ascii="Aptos" w:hAnsi="Aptos"/>
+          <w:color w:val="232323"/>
+          <w:sz w:val="18"/>
+        </w:rPr>
+        <w:t>Supported theft/fraud investigations, evidence collection, case documentation, and safety standards; worked with TrueEye and TruScan automated skip-scan detection workflows.</w:t>
       </w:r>
     </w:p>
     <w:p>
       <w:pPr>
-        <w:pStyle w:val="Heading2"/>
-        <w:tabs>
-          <w:tab w:pos="10368" w:val="right"/>
-        </w:tabs>
+        <w:spacing w:after="0"/>
       </w:pPr>
       <w:r>
-        <w:t>Hidaka USA</w:t>
-      </w:r>
-      <w:r>
-        <w:rPr>
-          <w:b w:val="0"/>
-          <w:sz w:val="19"/>
-        </w:rPr>
-        <w:tab/>
-        <w:t>2026</w:t>
+        <w:br w:type="page"/>
       </w:r>
     </w:p>
     <w:p>
       <w:pPr>
         <w:keepNext/>
-        <w:spacing w:after="80"/>
+        <w:spacing w:before="56" w:after="10"/>
       </w:pPr>
       <w:r>
         <w:rPr>
-          <w:i/>
+          <w:rFonts w:ascii="Aptos" w:hAnsi="Aptos"/>
+          <w:b/>
+          <w:color w:val="232323"/>
+          <w:sz w:val="19"/>
         </w:rPr>
-        <w:t>TMS/WMS Specialist and Shipping Associate</w:t>
+        <w:t>UPS</w:t>
+      </w:r>
+      <w:r>
+        <w:rPr>
+          <w:rFonts w:ascii="Aptos" w:hAnsi="Aptos"/>
+          <w:b/>
+          <w:color w:val="1F374E"/>
+          <w:sz w:val="19"/>
+        </w:rPr>
+        <w:t xml:space="preserve"> | Dispatch and Building Automation Supervisor</w:t>
+      </w:r>
+      <w:r>
+        <w:rPr>
+          <w:rFonts w:ascii="Aptos" w:hAnsi="Aptos"/>
+          <w:color w:val="5F5F5F"/>
+          <w:sz w:val="18"/>
+        </w:rPr>
+        <w:t xml:space="preserve">   January 2023 - May 2024</w:t>
       </w:r>
     </w:p>
     <w:p>
       <w:pPr>
         <w:pStyle w:val="ListBullet"/>
-        <w:numPr>
-          <w:ilvl w:val="0"/>
-          <w:numId w:val="40"/>
-        </w:numPr>
+        <w:spacing w:after="23" w:line="245" w:lineRule="auto"/>
+        <w:ind w:left="259" w:hanging="187"/>
       </w:pPr>
       <w:r>
-        <w:t>Supported manufacturing logistics through transportation and warehouse systems, outbound freight, receiving, inventory movement, and production coordination.</w:t>
+        <w:rPr>
+          <w:rFonts w:ascii="Aptos" w:hAnsi="Aptos"/>
+          <w:color w:val="232323"/>
+          <w:sz w:val="18"/>
+        </w:rPr>
+        <w:t>Coordinated 70 drivers across multiple municipalities, managing route priorities, dispatch, service disruptions, and real-time operating adjustments.</w:t>
       </w:r>
     </w:p>
     <w:p>
       <w:pPr>
         <w:pStyle w:val="ListBullet"/>
-        <w:numPr>
-          <w:ilvl w:val="0"/>
-          <w:numId w:val="40"/>
-        </w:numPr>
+        <w:spacing w:after="23" w:line="245" w:lineRule="auto"/>
+        <w:ind w:left="259" w:hanging="187"/>
       </w:pPr>
       <w:r>
-        <w:t>Maintained zero shipping and quality errors over three months; implemented workflow improvements producing approximately $2,000 in weekly savings.</w:t>
+        <w:rPr>
+          <w:rFonts w:ascii="Aptos" w:hAnsi="Aptos"/>
+          <w:color w:val="232323"/>
+          <w:sz w:val="18"/>
+        </w:rPr>
+        <w:t>Generated approximately $86,000 in estimated annual logistics savings through route optimization and workflow improvements; reduced overtime 20% through workforce balancing.</w:t>
       </w:r>
     </w:p>
     <w:p>
       <w:pPr>
-        <w:pStyle w:val="Heading2"/>
-        <w:tabs>
-          <w:tab w:pos="10368" w:val="right"/>
-        </w:tabs>
+        <w:pStyle w:val="ListBullet"/>
+        <w:spacing w:after="23" w:line="245" w:lineRule="auto"/>
+        <w:ind w:left="259" w:hanging="187"/>
       </w:pPr>
       <w:r>
-        <w:t>Schneider</w:t>
-      </w:r>
-      <w:r>
         <w:rPr>
-          <w:b w:val="0"/>
-          <w:sz w:val="19"/>
+          <w:rFonts w:ascii="Aptos" w:hAnsi="Aptos"/>
+          <w:color w:val="232323"/>
+          <w:sz w:val="18"/>
         </w:rPr>
-        <w:tab/>
-        <w:t>2025</w:t>
+        <w:t>Monitored automated sort-system conditions and maintained service reliability while coordinating driver communication and dispatch changes.</w:t>
       </w:r>
     </w:p>
     <w:p>
       <w:pPr>
         <w:keepNext/>
-        <w:spacing w:after="80"/>
+        <w:spacing w:before="56" w:after="10"/>
       </w:pPr>
       <w:r>
         <w:rPr>
-          <w:i/>
+          <w:rFonts w:ascii="Aptos" w:hAnsi="Aptos"/>
+          <w:b/>
+          <w:color w:val="232323"/>
+          <w:sz w:val="19"/>
         </w:rPr>
-        <w:t>Implementation Team · Transportation Planning and Dispatch</w:t>
+        <w:t>UPS</w:t>
+      </w:r>
+      <w:r>
+        <w:rPr>
+          <w:rFonts w:ascii="Aptos" w:hAnsi="Aptos"/>
+          <w:b/>
+          <w:color w:val="1F374E"/>
+          <w:sz w:val="19"/>
+        </w:rPr>
+        <w:t xml:space="preserve"> | Operations Supervisor</w:t>
+      </w:r>
+      <w:r>
+        <w:rPr>
+          <w:rFonts w:ascii="Aptos" w:hAnsi="Aptos"/>
+          <w:color w:val="5F5F5F"/>
+          <w:sz w:val="18"/>
+        </w:rPr>
+        <w:t xml:space="preserve">   August 2020 - December 2022</w:t>
       </w:r>
     </w:p>
     <w:p>
       <w:pPr>
         <w:pStyle w:val="ListBullet"/>
-        <w:numPr>
-          <w:ilvl w:val="0"/>
-          <w:numId w:val="40"/>
-        </w:numPr>
-      </w:pPr>
-      <w:r>
-        <w:t>Completed a one-month contract through Security Flaw Solutions (SFS) on the implementation team launching Schneider’s new Kroger account.</w:t>
-      </w:r>
-    </w:p>
-    <w:p>
-      <w:pPr>
-        <w:pStyle w:val="ListBullet"/>
-        <w:numPr>
-          <w:ilvl w:val="0"/>
-          <w:numId w:val="40"/>
-        </w:numPr>
-      </w:pPr>
-      <w:r>
-        <w:t>Helped establish operations for critical food shipments as the team began supporting the new account.</w:t>
-      </w:r>
-    </w:p>
-    <w:p>
-      <w:pPr>
-        <w:pStyle w:val="ListBullet"/>
-        <w:numPr>
-          <w:ilvl w:val="0"/>
-          <w:numId w:val="40"/>
-        </w:numPr>
-      </w:pPr>
-      <w:r>
-        <w:t>Coordinated dispatch, transportation scheduling, and shipment tracking; resolved scheduling conflicts and maintained operational reports and transportation documentation.</w:t>
-      </w:r>
-    </w:p>
-    <w:p>
-      <w:pPr>
-        <w:pStyle w:val="Heading1"/>
-        <w:pageBreakBefore/>
-        <w:spacing w:before="0"/>
-      </w:pPr>
-      <w:r>
-        <w:t>PROFESSIONAL EXPERIENCE CONTINUED</w:t>
-      </w:r>
-    </w:p>
-    <w:p>
-      <w:pPr>
-        <w:pStyle w:val="Heading2"/>
-        <w:tabs>
-          <w:tab w:pos="10368" w:val="right"/>
-        </w:tabs>
-      </w:pPr>
-      <w:r>
-        <w:t>Target</w:t>
-      </w:r>
-      <w:r>
-        <w:rPr>
-          <w:b w:val="0"/>
-          <w:sz w:val="19"/>
-        </w:rPr>
-        <w:tab/>
-        <w:t>2024 – 2025</w:t>
-      </w:r>
-    </w:p>
-    <w:p>
-      <w:pPr>
-        <w:keepNext/>
-        <w:spacing w:after="80"/>
+        <w:spacing w:after="23" w:line="245" w:lineRule="auto"/>
+        <w:ind w:left="259" w:hanging="187"/>
       </w:pPr>
       <w:r>
         <w:rPr>
-          <w:i/>
+          <w:rFonts w:ascii="Aptos" w:hAnsi="Aptos"/>
+          <w:color w:val="232323"/>
+          <w:sz w:val="18"/>
         </w:rPr>
-        <w:t>Security Specialist in Asset Protection</w:t>
-      </w:r>
-    </w:p>
-    <w:p>
-      <w:pPr>
-        <w:pStyle w:val="ListBullet"/>
-        <w:numPr>
-          <w:ilvl w:val="0"/>
-          <w:numId w:val="40"/>
-        </w:numPr>
-      </w:pPr>
-      <w:r>
-        <w:t>Supported theft and fraud investigations through evidence collection, case documentation, and coordination with law enforcement; maintained safety and asset-protection standards.</w:t>
-      </w:r>
-    </w:p>
-    <w:p>
-      <w:pPr>
-        <w:pStyle w:val="ListBullet"/>
-        <w:numPr>
-          <w:ilvl w:val="0"/>
-          <w:numId w:val="40"/>
-        </w:numPr>
-      </w:pPr>
-      <w:r>
-        <w:t>Worked with TrueEye and TruScan automated skip-scan detection workflows and supported retail loss-prevention operations.</w:t>
-      </w:r>
-    </w:p>
-    <w:p>
-      <w:pPr>
-        <w:pStyle w:val="Heading2"/>
-        <w:tabs>
-          <w:tab w:pos="10368" w:val="right"/>
-        </w:tabs>
-      </w:pPr>
-      <w:r>
-        <w:t>UPS</w:t>
-      </w:r>
-      <w:r>
-        <w:rPr>
-          <w:b w:val="0"/>
-          <w:sz w:val="19"/>
-        </w:rPr>
-        <w:tab/>
-        <w:t>January 2023 – May 2024</w:t>
-      </w:r>
-    </w:p>
-    <w:p>
-      <w:pPr>
-        <w:keepNext/>
-        <w:spacing w:after="80"/>
-      </w:pPr>
-      <w:r>
-        <w:rPr>
-          <w:i/>
-        </w:rPr>
-        <w:t>Dispatch and Building Automation Supervisor</w:t>
-      </w:r>
-    </w:p>
-    <w:p>
-      <w:pPr>
-        <w:pStyle w:val="ListBullet"/>
-        <w:numPr>
-          <w:ilvl w:val="0"/>
-          <w:numId w:val="40"/>
-        </w:numPr>
-      </w:pPr>
-      <w:r>
-        <w:t>Coordinated 70 drivers across multiple municipalities, managing route priorities, dispatch, transportation disruptions, and daily service execution.</w:t>
-      </w:r>
-    </w:p>
-    <w:p>
-      <w:pPr>
-        <w:pStyle w:val="ListBullet"/>
-        <w:numPr>
-          <w:ilvl w:val="0"/>
-          <w:numId w:val="40"/>
-        </w:numPr>
-      </w:pPr>
-      <w:r>
-        <w:t>Generated approximately $86,000 in estimated annual logistics savings through route optimization and workflow improvements; reduced overtime by 20% through workforce balancing.</w:t>
-      </w:r>
-    </w:p>
-    <w:p>
-      <w:pPr>
-        <w:pStyle w:val="ListBullet"/>
-        <w:numPr>
-          <w:ilvl w:val="0"/>
-          <w:numId w:val="40"/>
-        </w:numPr>
-      </w:pPr>
-      <w:r>
-        <w:t>Managed driver communication and real-time operating adjustments while monitoring automated sort-system conditions and maintaining service reliability.</w:t>
-      </w:r>
-    </w:p>
-    <w:p>
-      <w:pPr>
-        <w:pStyle w:val="Heading2"/>
-        <w:tabs>
-          <w:tab w:pos="10368" w:val="right"/>
-        </w:tabs>
-      </w:pPr>
-      <w:r>
-        <w:t>UPS</w:t>
-      </w:r>
-      <w:r>
-        <w:rPr>
-          <w:b w:val="0"/>
-          <w:sz w:val="19"/>
-        </w:rPr>
-        <w:tab/>
-        <w:t>August 2020 – December 2022</w:t>
-      </w:r>
-    </w:p>
-    <w:p>
-      <w:pPr>
-        <w:keepNext/>
-        <w:spacing w:after="80"/>
-      </w:pPr>
-      <w:r>
-        <w:rPr>
-          <w:i/>
-        </w:rPr>
-        <w:t>Operations Supervisor</w:t>
-      </w:r>
-    </w:p>
-    <w:p>
-      <w:pPr>
-        <w:pStyle w:val="ListBullet"/>
-        <w:numPr>
-          <w:ilvl w:val="0"/>
-          <w:numId w:val="40"/>
-        </w:numPr>
-      </w:pPr>
-      <w:r>
         <w:t>Led 70+ employees in a high-volume package distribution operation, managing labor allocation, quality, safety, service performance, and employee development.</w:t>
       </w:r>
     </w:p>
     <w:p>
       <w:pPr>
         <w:pStyle w:val="ListBullet"/>
-        <w:numPr>
-          <w:ilvl w:val="0"/>
-          <w:numId w:val="40"/>
-        </w:numPr>
+        <w:spacing w:after="23" w:line="245" w:lineRule="auto"/>
+        <w:ind w:left="259" w:hanging="187"/>
       </w:pPr>
       <w:r>
-        <w:t>Reduced daily misloads from approximately 100 to fewer than 10 over three months through process improvement and frontline coaching; approximately $1.17 million in estimated annualized cost avoidance using 90 fewer misloads per day x $50 x 260 operating days.</w:t>
+        <w:rPr>
+          <w:rFonts w:ascii="Aptos" w:hAnsi="Aptos"/>
+          <w:color w:val="232323"/>
+          <w:sz w:val="18"/>
+        </w:rPr>
+        <w:t>Reduced daily misloads from approximately 100 to fewer than 10 over three months; ~$1.17M estimated annualized cost avoidance using 90 fewer misloads/day x $50 x 260 operating days.</w:t>
       </w:r>
     </w:p>
     <w:p>
       <w:pPr>
         <w:pStyle w:val="ListBullet"/>
-        <w:numPr>
-          <w:ilvl w:val="0"/>
-          <w:numId w:val="40"/>
-        </w:numPr>
+        <w:spacing w:after="23" w:line="245" w:lineRule="auto"/>
+        <w:ind w:left="259" w:hanging="187"/>
       </w:pPr>
       <w:r>
+        <w:rPr>
+          <w:rFonts w:ascii="Aptos" w:hAnsi="Aptos"/>
+          <w:color w:val="232323"/>
+          <w:sz w:val="18"/>
+        </w:rPr>
         <w:t>Led operations supporting Pfizer COVID-19 vaccine distribution with zero distribution failures and 100% chain-of-custody integrity.</w:t>
       </w:r>
     </w:p>
     <w:p>
       <w:pPr>
-        <w:pStyle w:val="Heading1"/>
+        <w:keepNext/>
+        <w:spacing w:before="140" w:after="60"/>
+        <w:pBdr>
+          <w:bottom w:val="single" w:sz="8" w:space="2" w:color="B7C5D1"/>
+        </w:pBdr>
       </w:pPr>
       <w:r>
+        <w:rPr>
+          <w:rFonts w:ascii="Aptos" w:hAnsi="Aptos"/>
+          <w:b/>
+          <w:color w:val="1F374E"/>
+          <w:sz w:val="20"/>
+        </w:rPr>
         <w:t>INDEPENDENT PRODUCT DELIVERY</w:t>
       </w:r>
     </w:p>
     <w:p>
       <w:pPr>
-        <w:pStyle w:val="Heading2"/>
+        <w:keepNext/>
+        <w:spacing w:before="56" w:after="10"/>
       </w:pPr>
       <w:r>
+        <w:rPr>
+          <w:rFonts w:ascii="Aptos" w:hAnsi="Aptos"/>
+          <w:b/>
+          <w:color w:val="232323"/>
+          <w:sz w:val="19"/>
+        </w:rPr>
         <w:t>Security Flaw Solutions</w:t>
+      </w:r>
+      <w:r>
+        <w:rPr>
+          <w:rFonts w:ascii="Aptos" w:hAnsi="Aptos"/>
+          <w:b/>
+          <w:color w:val="1F374E"/>
+          <w:sz w:val="19"/>
+        </w:rPr>
+        <w:t xml:space="preserve"> | Founder &amp; Lead Developer</w:t>
+      </w:r>
+      <w:r>
+        <w:rPr>
+          <w:rFonts w:ascii="Aptos" w:hAnsi="Aptos"/>
+          <w:color w:val="5F5F5F"/>
+          <w:sz w:val="18"/>
+        </w:rPr>
+        <w:t xml:space="preserve">   2025 - 2026</w:t>
+      </w:r>
+    </w:p>
+    <w:p>
+      <w:pPr>
+        <w:pStyle w:val="ListBullet"/>
+        <w:spacing w:after="23" w:line="245" w:lineRule="auto"/>
+        <w:ind w:left="259" w:hanging="187"/>
+      </w:pPr>
+      <w:r>
+        <w:rPr>
+          <w:rFonts w:ascii="Aptos" w:hAnsi="Aptos"/>
+          <w:color w:val="232323"/>
+          <w:sz w:val="18"/>
+        </w:rPr>
+        <w:t>Designed, built, deployed, and sold AIncident, an AI-powered operational reporting platform, for $5,000 from requirements through commercial delivery.</w:t>
+      </w:r>
+    </w:p>
+    <w:p>
+      <w:pPr>
+        <w:pStyle w:val="ListBullet"/>
+        <w:spacing w:after="23" w:line="245" w:lineRule="auto"/>
+        <w:ind w:left="259" w:hanging="187"/>
+      </w:pPr>
+      <w:r>
+        <w:rPr>
+          <w:rFonts w:ascii="Aptos" w:hAnsi="Aptos"/>
+          <w:color w:val="232323"/>
+          <w:sz w:val="18"/>
+        </w:rPr>
+        <w:t>Built application workflows with Python, FastAPI, PostgreSQL, Streamlit, AWS, and Docker; applied operations experience to structured reporting and usable software.</w:t>
       </w:r>
     </w:p>
     <w:p>
       <w:pPr>
         <w:keepNext/>
+        <w:spacing w:before="140" w:after="60"/>
+        <w:pBdr>
+          <w:bottom w:val="single" w:sz="8" w:space="2" w:color="B7C5D1"/>
+        </w:pBdr>
       </w:pPr>
       <w:r>
         <w:rPr>
-          <w:i/>
+          <w:rFonts w:ascii="Aptos" w:hAnsi="Aptos"/>
+          <w:b/>
+          <w:color w:val="1F374E"/>
+          <w:sz w:val="20"/>
         </w:rPr>
-        <w:t>Founder and Lead Developer · AIncident</w:t>
+        <w:t>TECHNICAL SKILLS</w:t>
       </w:r>
     </w:p>
     <w:p>
       <w:pPr>
-        <w:pStyle w:val="ListBullet"/>
-        <w:numPr>
-          <w:ilvl w:val="0"/>
-          <w:numId w:val="40"/>
-        </w:numPr>
+        <w:spacing w:after="20"/>
       </w:pPr>
       <w:r>
-        <w:t>Designed, built, deployed, and sold an AI-powered operational reporting platform for $4,995, taking the product from requirements through commercial delivery.</w:t>
+        <w:rPr>
+          <w:rFonts w:ascii="Aptos" w:hAnsi="Aptos"/>
+          <w:color w:val="232323"/>
+          <w:sz w:val="17"/>
+        </w:rPr>
+        <w:t>Power BI | SQL | Python | FastAPI | PostgreSQL | Streamlit | AWS | Docker | Microsoft Excel | TMS/WMS Workflows | Blue Yonder Staffing &amp; Attendance | AI-Augmented Full-Stack Development</w:t>
       </w:r>
     </w:p>
     <w:p>
       <w:pPr>
-        <w:pStyle w:val="ListBullet"/>
-        <w:numPr>
-          <w:ilvl w:val="0"/>
-          <w:numId w:val="40"/>
-        </w:numPr>
+        <w:keepNext/>
+        <w:spacing w:before="140" w:after="60"/>
+        <w:pBdr>
+          <w:bottom w:val="single" w:sz="8" w:space="2" w:color="B7C5D1"/>
+        </w:pBdr>
       </w:pPr>
       <w:r>
-        <w:t>Built application workflows with Python, FastAPI, PostgreSQL, and Streamlit; applied operational experience to structured reporting and usable software.</w:t>
+        <w:rPr>
+          <w:rFonts w:ascii="Aptos" w:hAnsi="Aptos"/>
+          <w:b/>
+          <w:color w:val="1F374E"/>
+          <w:sz w:val="20"/>
+        </w:rPr>
+        <w:t>EDUCATION &amp; PROFESSIONAL DEVELOPMENT</w:t>
       </w:r>
     </w:p>
     <w:p>
       <w:pPr>
-        <w:pStyle w:val="Heading1"/>
+        <w:spacing w:after="0"/>
       </w:pPr>
       <w:r>
-        <w:t>EDUCATION AND PROFESSIONAL DEVELOPMENT</w:t>
+        <w:rPr>
+          <w:rFonts w:ascii="Aptos" w:hAnsi="Aptos"/>
+          <w:b/>
+          <w:sz w:val="18"/>
+        </w:rPr>
+        <w:t>Mechanical Engineering coursework, University of Cincinnati</w:t>
+      </w:r>
+      <w:r>
+        <w:rPr>
+          <w:rFonts w:ascii="Aptos" w:hAnsi="Aptos"/>
+          <w:sz w:val="18"/>
+        </w:rPr>
+        <w:t xml:space="preserve">  |  High School Diploma, Hilliard Davidson High School</w:t>
       </w:r>
     </w:p>
     <w:p>
+      <w:pPr>
+        <w:spacing w:after="0"/>
+      </w:pPr>
       <w:r>
-        <w:t>Mechanical Engineering coursework, University of Cincinnati</w:t>
-      </w:r>
-    </w:p>
-    <w:p>
-      <w:r>
-        <w:t>High School Diploma, Hilliard Davidson High School</w:t>
-      </w:r>
-    </w:p>
-    <w:p>
-      <w:r>
+        <w:rPr>
+          <w:rFonts w:ascii="Aptos" w:hAnsi="Aptos"/>
+          <w:color w:val="232323"/>
+          <w:sz w:val="17"/>
+        </w:rPr>
         <w:t>Certified Forklift Operator | FedEx QDM coursework in progress | IBM AI Engineering Professional Certificate in progress</w:t>
       </w:r>
     </w:p>
     <w:sectPr>
-      <w:footerReference w:type="default" r:id="rId11"/>
+      <w:footerReference w:type="default" r:id="rId10"/>
       <w:pgSz w:w="12240" w:h="15840"/>
-      <w:pgMar w:top="864" w:right="936" w:bottom="792" w:left="936" w:header="360" w:footer="360" w:gutter="0"/>
+      <w:pgMar w:top="605" w:right="792" w:bottom="605" w:left="792" w:header="288" w:footer="288" w:gutter="0"/>
       <w:cols w:space="720"/>
       <w:docGrid w:linePitch="360"/>
     </w:sectPr>
@@ -602,15 +910,22 @@
   <w:p>
     <w:pPr>
       <w:pStyle w:val="Footer"/>
-      <w:jc w:val="right"/>
+      <w:jc w:val="center"/>
     </w:pPr>
     <w:r>
       <w:rPr>
-        <w:rFonts w:ascii="Arial" w:hAnsi="Arial"/>
-        <w:color w:val="555555"/>
-        <w:sz w:val="16"/>
-      </w:rPr>
-      <w:t xml:space="preserve">Hari Simran Khalsa  |  </w:t>
+        <w:rFonts w:ascii="Aptos" w:hAnsi="Aptos"/>
+        <w:color w:val="5F5F5F"/>
+        <w:sz w:val="15"/>
+      </w:rPr>
+      <w:t>Hari Simran Khalsa</w:t>
+    </w:r>
+    <w:r>
+      <w:rPr>
+        <w:color w:val="5F5F5F"/>
+        <w:sz w:val="15"/>
+      </w:rPr>
+      <w:t xml:space="preserve">  |  </w:t>
     </w:r>
     <w:fldSimple w:instr="PAGE"/>
   </w:p>
@@ -816,20 +1131,6 @@
   </w:num>
   <w:num w:numId="9">
     <w:abstractNumId w:val="0"/>
-  </w:num>
-  <w:abstractNum w:abstractNumId="40">
-    <w:lvl w:ilvl="0">
-      <w:start w:val="1"/>
-      <w:numFmt w:val="bullet"/>
-      <w:lvlText w:val="•"/>
-      <w:lvlJc w:val="left"/>
-      <w:pPr>
-        <w:ind w:left="200" w:hanging="200"/>
-      </w:pPr>
-    </w:lvl>
-  </w:abstractNum>
-  <w:num w:numId="40">
-    <w:abstractNumId w:val="40"/>
   </w:num>
 </w:numbering>
 </file>
@@ -995,13 +1296,12 @@
     <w:qFormat/>
     <w:rsid w:val="00FC693F"/>
     <w:pPr>
-      <w:widowControl/>
-      <w:spacing w:line="250" w:lineRule="auto" w:after="60"/>
+      <w:spacing w:after="0" w:line="240" w:lineRule="auto"/>
     </w:pPr>
     <w:rPr>
-      <w:rFonts w:ascii="Arial" w:hAnsi="Arial"/>
-      <w:color w:val="000000"/>
-      <w:sz w:val="21"/>
+      <w:rFonts w:ascii="Aptos" w:hAnsi="Aptos"/>
+      <w:color w:val="232323"/>
+      <w:sz w:val="18"/>
     </w:rPr>
   </w:style>
   <w:style w:type="paragraph" w:styleId="Header">
@@ -1059,16 +1359,15 @@
     <w:pPr>
       <w:keepNext/>
       <w:keepLines/>
-      <w:widowControl/>
-      <w:spacing w:before="220" w:after="100" w:line="240" w:lineRule="auto"/>
+      <w:spacing w:before="480" w:after="0"/>
       <w:outlineLvl w:val="0"/>
     </w:pPr>
     <w:rPr>
-      <w:rFonts w:asciiTheme="majorHAnsi" w:eastAsiaTheme="majorEastAsia" w:hAnsiTheme="majorHAnsi" w:cstheme="majorBidi" w:ascii="Arial" w:hAnsi="Arial"/>
+      <w:rFonts w:asciiTheme="majorHAnsi" w:eastAsiaTheme="majorEastAsia" w:hAnsiTheme="majorHAnsi" w:cstheme="majorBidi"/>
       <w:b/>
       <w:bCs/>
-      <w:color w:val="000000"/>
-      <w:sz w:val="22"/>
+      <w:color w:val="365F91" w:themeColor="accent1" w:themeShade="BF"/>
+      <w:sz w:val="28"/>
       <w:szCs w:val="28"/>
     </w:rPr>
   </w:style>
@@ -1084,16 +1383,15 @@
     <w:pPr>
       <w:keepNext/>
       <w:keepLines/>
-      <w:widowControl/>
-      <w:spacing w:before="140" w:after="40" w:line="240" w:lineRule="auto"/>
+      <w:spacing w:before="200" w:after="0"/>
       <w:outlineLvl w:val="1"/>
     </w:pPr>
     <w:rPr>
-      <w:rFonts w:asciiTheme="majorHAnsi" w:eastAsiaTheme="majorEastAsia" w:hAnsiTheme="majorHAnsi" w:cstheme="majorBidi" w:ascii="Arial" w:hAnsi="Arial"/>
+      <w:rFonts w:asciiTheme="majorHAnsi" w:eastAsiaTheme="majorEastAsia" w:hAnsiTheme="majorHAnsi" w:cstheme="majorBidi"/>
       <w:b/>
       <w:bCs/>
-      <w:color w:val="000000"/>
-      <w:sz w:val="21"/>
+      <w:color w:val="4F81BD" w:themeColor="accent1"/>
+      <w:sz w:val="26"/>
       <w:szCs w:val="26"/>
     </w:rPr>
   </w:style>
@@ -1347,18 +1645,18 @@
     <w:qFormat/>
     <w:rsid w:val="00FC693F"/>
     <w:pPr>
-      <w:keepNext/>
-      <w:widowControl/>
-      <w:spacing w:after="60" w:line="240" w:lineRule="auto" w:before="0"/>
+      <w:pBdr>
+        <w:bottom w:val="single" w:sz="8" w:space="4" w:color="4F81BD" w:themeColor="accent1"/>
+      </w:pBdr>
+      <w:spacing w:after="300" w:line="240" w:lineRule="auto"/>
       <w:contextualSpacing/>
     </w:pPr>
     <w:rPr>
-      <w:rFonts w:asciiTheme="majorHAnsi" w:eastAsiaTheme="majorEastAsia" w:hAnsiTheme="majorHAnsi" w:cstheme="majorBidi" w:ascii="Arial" w:hAnsi="Arial"/>
-      <w:b/>
-      <w:color w:val="000000"/>
+      <w:rFonts w:asciiTheme="majorHAnsi" w:eastAsiaTheme="majorEastAsia" w:hAnsiTheme="majorHAnsi" w:cstheme="majorBidi"/>
+      <w:color w:val="17365D" w:themeColor="text2" w:themeShade="BF"/>
       <w:spacing w:val="5"/>
       <w:kern w:val="28"/>
-      <w:sz w:val="46"/>
+      <w:sz w:val="52"/>
       <w:szCs w:val="52"/>
     </w:rPr>
   </w:style>
@@ -1386,16 +1684,15 @@
     <w:qFormat/>
     <w:rsid w:val="00FC693F"/>
     <w:pPr>
-      <w:widowControl/>
       <w:numPr>
         <w:ilvl w:val="1"/>
       </w:numPr>
     </w:pPr>
     <w:rPr>
-      <w:rFonts w:asciiTheme="majorHAnsi" w:eastAsiaTheme="majorEastAsia" w:hAnsiTheme="majorHAnsi" w:cstheme="majorBidi" w:ascii="Arial" w:hAnsi="Arial"/>
+      <w:rFonts w:asciiTheme="majorHAnsi" w:eastAsiaTheme="majorEastAsia" w:hAnsiTheme="majorHAnsi" w:cstheme="majorBidi"/>
       <w:i/>
       <w:iCs/>
-      <w:color w:val="000000"/>
+      <w:color w:val="4F81BD" w:themeColor="accent1"/>
       <w:spacing w:val="15"/>
       <w:sz w:val="24"/>
       <w:szCs w:val="24"/>
@@ -1530,18 +1827,14 @@
     <w:unhideWhenUsed/>
     <w:rsid w:val="00326F90"/>
     <w:pPr>
-      <w:widowControl/>
       <w:numPr>
         <w:numId w:val="1"/>
       </w:numPr>
-      <w:spacing w:after="60" w:line="250" w:lineRule="auto"/>
-      <w:ind w:left="202" w:hanging="202"/>
       <w:contextualSpacing/>
     </w:pPr>
     <w:rPr>
-      <w:rFonts w:ascii="Arial" w:hAnsi="Arial"/>
-      <w:color w:val="000000"/>
-      <w:sz w:val="21"/>
+      <w:rFonts w:ascii="Aptos" w:hAnsi="Aptos"/>
+      <w:sz w:val="18"/>
     </w:rPr>
   </w:style>
   <w:style w:type="paragraph" w:styleId="ListBullet2">
@@ -1843,6 +2136,9 @@
     <w:qFormat/>
     <w:rsid w:val="00FC693F"/>
     <w:pPr>
+      <w:pBdr>
+        <w:bottom w:val="single" w:sz="4" w:space="4" w:color="4F81BD" w:themeColor="accent1"/>
+      </w:pBdr>
       <w:spacing w:before="200" w:after="280"/>
       <w:ind w:left="936" w:right="936"/>
     </w:pPr>

</xml_diff>

<commit_message>
Add operations analytics case study and clarify hiring portfolio
</commit_message>
<xml_diff>
--- a/Hari_Simran_Khalsa_Operations_Resume.docx
+++ b/Hari_Simran_Khalsa_Operations_Resume.docx
@@ -174,12 +174,7 @@
               <w:spacing w:after="0" w:line="240" w:lineRule="auto"/>
             </w:pPr>
             <w:r>
-              <w:rPr>
-                <w:rFonts w:ascii="Aptos" w:hAnsi="Aptos"/>
-                <w:color w:val="232323"/>
-                <w:sz w:val="17"/>
-              </w:rPr>
-              <w:t>Led 70+ employees at UPS; reduced daily misloads from ~100 to &lt;10 in three months (&gt;90%), representing ~$1.17M annualized cost avoidance at $50 per misload and 260 operating days.</w:t>
+              <w:t>Led 70+ employees at UPS; reduced daily misloads from ~100 to &lt;10 in three months (&gt;90%), representing ~$1.17M annualized cost avoidance at UPS’s internal $50-per-misload cost figure and 260 operating days.</w:t>
             </w:r>
           </w:p>
         </w:tc>
@@ -482,30 +477,7 @@
         <w:spacing w:before="56" w:after="10"/>
       </w:pPr>
       <w:r>
-        <w:rPr>
-          <w:rFonts w:ascii="Aptos" w:hAnsi="Aptos"/>
-          <w:b/>
-          <w:color w:val="232323"/>
-          <w:sz w:val="19"/>
-        </w:rPr>
-        <w:t>Schneider</w:t>
-      </w:r>
-      <w:r>
-        <w:rPr>
-          <w:rFonts w:ascii="Aptos" w:hAnsi="Aptos"/>
-          <w:b/>
-          <w:color w:val="1F374E"/>
-          <w:sz w:val="19"/>
-        </w:rPr>
-        <w:t xml:space="preserve"> | Transportation Planning and Dispatch</w:t>
-      </w:r>
-      <w:r>
-        <w:rPr>
-          <w:rFonts w:ascii="Aptos" w:hAnsi="Aptos"/>
-          <w:color w:val="5F5F5F"/>
-          <w:sz w:val="18"/>
-        </w:rPr>
-        <w:t xml:space="preserve">   2025</w:t>
+        <w:t>Schneider | Transportation Planning and Dispatch — SFS Contract   September–November 2025</w:t>
       </w:r>
     </w:p>
     <w:p>
@@ -515,12 +487,7 @@
         <w:ind w:left="259" w:hanging="187"/>
       </w:pPr>
       <w:r>
-        <w:rPr>
-          <w:rFonts w:ascii="Aptos" w:hAnsi="Aptos"/>
-          <w:color w:val="232323"/>
-          <w:sz w:val="18"/>
-        </w:rPr>
-        <w:t>Coordinated fleet dispatch, transportation scheduling, shipment tracking, and operational reporting; resolved scheduling conflicts and maintained transportation documentation.</w:t>
+        <w:t>Contracted through Security Flaw Solutions on the implementation team launching Schneider’s Kroger account; coordinated dispatch, scheduling, shipment tracking, and operational reporting.</w:t>
       </w:r>
     </w:p>
     <w:p>
@@ -709,12 +676,7 @@
         <w:ind w:left="259" w:hanging="187"/>
       </w:pPr>
       <w:r>
-        <w:rPr>
-          <w:rFonts w:ascii="Aptos" w:hAnsi="Aptos"/>
-          <w:color w:val="232323"/>
-          <w:sz w:val="18"/>
-        </w:rPr>
-        <w:t>Reduced daily misloads from approximately 100 to fewer than 10 over three months; ~$1.17M estimated annualized cost avoidance using 90 fewer misloads/day x $50 x 260 operating days.</w:t>
+        <w:t>Reduced daily misloads from approximately 100 to fewer than 10 over three months; ~$1.17M estimated annualized cost avoidance using 90 fewer misloads/day x UPS’s internal $50-per-misload cost figure x 260 operating days.</w:t>
       </w:r>
     </w:p>
     <w:p>
@@ -789,12 +751,7 @@
         <w:ind w:left="259" w:hanging="187"/>
       </w:pPr>
       <w:r>
-        <w:rPr>
-          <w:rFonts w:ascii="Aptos" w:hAnsi="Aptos"/>
-          <w:color w:val="232323"/>
-          <w:sz w:val="18"/>
-        </w:rPr>
-        <w:t>Designed, built, deployed, and sold AIncident, an AI-powered operational reporting platform, for $5,000 from requirements through commercial delivery.</w:t>
+        <w:t>Designed, built, deployed, and sold AIncident, an AI-powered operational reporting platform, for $4,995 from requirements through commercial delivery.</w:t>
       </w:r>
     </w:p>
     <w:p>

</xml_diff>

<commit_message>
Rebuild resume with detailed achievements and FedEx unload record
</commit_message>
<xml_diff>
--- a/Hari_Simran_Khalsa_Operations_Resume.docx
+++ b/Hari_Simran_Khalsa_Operations_Resume.docx
@@ -3,890 +3,477 @@
 <w:document xmlns:wpc="http://schemas.microsoft.com/office/word/2010/wordprocessingCanvas" xmlns:mo="http://schemas.microsoft.com/office/mac/office/2008/main" xmlns:mc="http://schemas.openxmlformats.org/markup-compatibility/2006" xmlns:mv="urn:schemas-microsoft-com:mac:vml" xmlns:o="urn:schemas-microsoft-com:office:office" xmlns:r="http://schemas.openxmlformats.org/officeDocument/2006/relationships" xmlns:m="http://schemas.openxmlformats.org/officeDocument/2006/math" xmlns:v="urn:schemas-microsoft-com:vml" xmlns:wp14="http://schemas.microsoft.com/office/word/2010/wordprocessingDrawing" xmlns:wp="http://schemas.openxmlformats.org/drawingml/2006/wordprocessingDrawing" xmlns:w10="urn:schemas-microsoft-com:office:word" xmlns:w="http://schemas.openxmlformats.org/wordprocessingml/2006/main" xmlns:w14="http://schemas.microsoft.com/office/word/2010/wordml" xmlns:wpg="http://schemas.microsoft.com/office/word/2010/wordprocessingGroup" xmlns:wpi="http://schemas.microsoft.com/office/word/2010/wordprocessingInk" xmlns:wne="http://schemas.microsoft.com/office/word/2006/wordml" xmlns:wps="http://schemas.microsoft.com/office/word/2010/wordprocessingShape" mc:Ignorable="w14 wp14">
   <w:body>
     <w:p>
-      <w:pPr>
-        <w:spacing w:after="20"/>
-        <w:jc w:val="center"/>
-      </w:pPr>
       <w:r>
         <w:rPr>
-          <w:rFonts w:ascii="Aptos Display" w:hAnsi="Aptos Display"/>
           <w:b/>
-          <w:color w:val="1F374E"/>
-          <w:sz w:val="40"/>
+          <w:color w:val="142B43"/>
+          <w:sz w:val="46"/>
         </w:rPr>
         <w:t>HARI SIMRAN KHALSA</w:t>
       </w:r>
     </w:p>
     <w:p>
-      <w:pPr>
-        <w:spacing w:after="40"/>
-        <w:jc w:val="center"/>
-      </w:pPr>
       <w:r>
         <w:rPr>
-          <w:rFonts w:ascii="Aptos" w:hAnsi="Aptos"/>
           <w:b/>
-          <w:color w:val="5F5F5F"/>
-          <w:sz w:val="18"/>
         </w:rPr>
-        <w:t>OPERATIONS LEADERSHIP | PROCESS IMPROVEMENT | LOGISTICS TECHNOLOGY</w:t>
+        <w:t>OPERATIONS LEADERSHIP | SYSTEMS &amp; IMPLEMENTATION | CONTINUOUS IMPROVEMENT</w:t>
+      </w:r>
+    </w:p>
+    <w:p>
+      <w:r>
+        <w:t>Dublin, Ohio | hkhalsa095@gmail.com | https://sfskhalsa101.github.io/hari-simran-khalsa-portfolio/</w:t>
       </w:r>
     </w:p>
     <w:p>
       <w:pPr>
-        <w:spacing w:after="100"/>
-        <w:jc w:val="center"/>
+        <w:pStyle w:val="Heading1"/>
       </w:pPr>
       <w:r>
-        <w:rPr>
-          <w:rFonts w:ascii="Aptos" w:hAnsi="Aptos"/>
-          <w:color w:val="232323"/>
-          <w:sz w:val="18"/>
-        </w:rPr>
-        <w:t>Dublin, Ohio</w:t>
+        <w:t>PROFILE</w:t>
       </w:r>
-      <w:r>
-        <w:t xml:space="preserve">  |  </w:t>
-      </w:r>
-      <w:r>
-        <w:rPr>
-          <w:rFonts w:ascii="Aptos" w:hAnsi="Aptos"/>
-          <w:color w:val="232323"/>
-          <w:sz w:val="18"/>
-        </w:rPr>
-      </w:r>
-      <w:r/>
-      <w:r>
-        <w:rPr>
-          <w:rFonts w:ascii="Aptos" w:hAnsi="Aptos"/>
-          <w:color w:val="232323"/>
-          <w:sz w:val="18"/>
-        </w:rPr>
-        <w:t>hkhalsa095@gmail.com</w:t>
-      </w:r>
-      <w:r>
-        <w:t xml:space="preserve">  |  </w:t>
-      </w:r>
-      <w:hyperlink r:id="rId9">
-        <w:r>
-          <w:rPr>
-            <w:color w:val="1F4E79"/>
-            <w:u w:val="single"/>
-            <w:rFonts w:ascii="Aptos" w:hAnsi="Aptos"/>
-            <w:sz w:val="19"/>
-          </w:rPr>
-          <w:t>Portfolio Website</w:t>
-        </w:r>
-      </w:hyperlink>
     </w:p>
     <w:p>
-      <w:pPr>
-        <w:keepNext/>
-        <w:spacing w:before="140" w:after="60"/>
-        <w:pBdr>
-          <w:bottom w:val="single" w:sz="8" w:space="2" w:color="B7C5D1"/>
-        </w:pBdr>
-      </w:pPr>
       <w:r>
-        <w:rPr>
-          <w:rFonts w:ascii="Aptos" w:hAnsi="Aptos"/>
-          <w:b/>
-          <w:color w:val="1F374E"/>
-          <w:sz w:val="20"/>
-        </w:rPr>
-        <w:t>PROFESSIONAL PROFILE</w:t>
+        <w:t>Operations and systems leader with 5+ years across parcel distribution, dispatch, manufacturing logistics, and software delivery. Led 70+ employees and coordinated 70 drivers; delivered measurable improvements in quality, labor utilization, and transportation costs. Builds practical tools that connect frontline requirements with clear data and operational decisions.</w:t>
       </w:r>
     </w:p>
     <w:p>
       <w:pPr>
-        <w:spacing w:after="60" w:line="247" w:lineRule="auto"/>
+        <w:pStyle w:val="Heading1"/>
       </w:pPr>
       <w:r>
-        <w:rPr>
-          <w:rFonts w:ascii="Aptos" w:hAnsi="Aptos"/>
-          <w:color w:val="232323"/>
-          <w:sz w:val="18"/>
-        </w:rPr>
-        <w:t>Operations and logistics leader with 5+ years of experience across parcel distribution, dispatch, transportation planning, manufacturing logistics, and operational technology. Entered FedEx with prior experience leading teams of 70+, delivering measurable cost and quality improvements, managing transportation operations, and building/deploying operational software. Combines frontline leadership with continuous-improvement discipline, data tools, and systems fluency.</w:t>
+        <w:t>CORE CAPABILITIES</w:t>
+      </w:r>
+    </w:p>
+    <w:p>
+      <w:r>
+        <w:t>Team leadership &amp; coaching • Workforce planning • Continuous improvement • Dispatch &amp; route planning • Quality &amp; service KPIs • TMS/WMS workflows • Blue Yonder • Excel • SQL • Power BI • Python • FastAPI • PostgreSQL • AWS • Docker</w:t>
+      </w:r>
+    </w:p>
+    <w:p>
+      <w:pPr>
+        <w:pStyle w:val="Heading1"/>
+      </w:pPr>
+      <w:r>
+        <w:t>OPERATIONS LEADERSHIP</w:t>
+      </w:r>
+    </w:p>
+    <w:p>
+      <w:pPr>
+        <w:pStyle w:val="Heading2"/>
+      </w:pPr>
+      <w:r>
+        <w:t>FedEx | Operations Supervisor</w:t>
       </w:r>
     </w:p>
     <w:p>
       <w:pPr>
         <w:keepNext/>
-        <w:spacing w:before="140" w:after="60"/>
-        <w:pBdr>
-          <w:bottom w:val="single" w:sz="8" w:space="2" w:color="B7C5D1"/>
-        </w:pBdr>
       </w:pPr>
       <w:r>
         <w:rPr>
-          <w:rFonts w:ascii="Aptos" w:hAnsi="Aptos"/>
-          <w:b/>
-          <w:color w:val="1F374E"/>
-          <w:sz w:val="20"/>
+          <w:color w:val="556575"/>
+          <w:sz w:val="17"/>
         </w:rPr>
-        <w:t>PRE-HIRE EXPERIENCE &amp; QUANTIFIED IMPACT</w:t>
-      </w:r>
-    </w:p>
-    <w:tbl>
-      <w:tblPr>
-        <w:tblW w:type="auto" w:w="0"/>
-        <w:jc w:val="center"/>
-        <w:tblLayout w:type="fixed"/>
-        <w:tblLook w:firstColumn="1" w:firstRow="1" w:lastColumn="0" w:lastRow="0" w:noHBand="0" w:noVBand="1" w:val="04A0"/>
-      </w:tblPr>
-      <w:tblGrid>
-        <w:gridCol w:w="5328"/>
-        <w:gridCol w:w="5328"/>
-      </w:tblGrid>
-      <w:tr>
-        <w:trPr>
-          <w:cantSplit/>
-        </w:trPr>
-        <w:tc>
-          <w:tcPr>
-            <w:tcW w:type="dxa" w:w="5112"/>
-            <w:shd w:fill="F3F6F8"/>
-            <w:tcMar>
-              <w:top w:w="70" w:type="dxa"/>
-              <w:start w:w="110" w:type="dxa"/>
-              <w:bottom w:w="70" w:type="dxa"/>
-              <w:end w:w="110" w:type="dxa"/>
-            </w:tcMar>
-            <w:vAlign w:val="top"/>
-          </w:tcPr>
-          <w:p>
-            <w:pPr>
-              <w:spacing w:after="20"/>
-            </w:pPr>
-            <w:r>
-              <w:rPr>
-                <w:rFonts w:ascii="Aptos" w:hAnsi="Aptos"/>
-                <w:b/>
-                <w:color w:val="1F374E"/>
-                <w:sz w:val="16"/>
-              </w:rPr>
-              <w:t>PARCEL OPERATIONS</w:t>
-            </w:r>
-          </w:p>
-          <w:p>
-            <w:pPr>
-              <w:spacing w:after="0" w:line="240" w:lineRule="auto"/>
-            </w:pPr>
-            <w:r>
-              <w:t>Led 70+ employees at UPS; reduced daily misloads from ~100 to &lt;10 in three months (&gt;90%), representing ~$1.17M annualized cost avoidance at UPS’s internal $50-per-misload cost figure and 260 operating days.</w:t>
-            </w:r>
-          </w:p>
-        </w:tc>
-        <w:tc>
-          <w:tcPr>
-            <w:tcW w:type="dxa" w:w="5112"/>
-            <w:shd w:fill="F3F6F8"/>
-            <w:tcMar>
-              <w:top w:w="70" w:type="dxa"/>
-              <w:start w:w="110" w:type="dxa"/>
-              <w:bottom w:w="70" w:type="dxa"/>
-              <w:end w:w="110" w:type="dxa"/>
-            </w:tcMar>
-            <w:vAlign w:val="top"/>
-          </w:tcPr>
-          <w:p>
-            <w:pPr>
-              <w:spacing w:after="20"/>
-            </w:pPr>
-            <w:r>
-              <w:rPr>
-                <w:rFonts w:ascii="Aptos" w:hAnsi="Aptos"/>
-                <w:b/>
-                <w:color w:val="1F374E"/>
-                <w:sz w:val="16"/>
-              </w:rPr>
-              <w:t>DISPATCH &amp; LABOR</w:t>
-            </w:r>
-          </w:p>
-          <w:p>
-            <w:pPr>
-              <w:spacing w:after="0" w:line="240" w:lineRule="auto"/>
-            </w:pPr>
-            <w:r>
-              <w:rPr>
-                <w:rFonts w:ascii="Aptos" w:hAnsi="Aptos"/>
-                <w:color w:val="232323"/>
-                <w:sz w:val="17"/>
-              </w:rPr>
-              <w:t>Coordinated 70 drivers; generated ~$86K in estimated annual logistics savings through route/workflow optimization and reduced overtime 20% through workforce balancing.</w:t>
-            </w:r>
-          </w:p>
-        </w:tc>
-      </w:tr>
-      <w:tr>
-        <w:trPr>
-          <w:cantSplit/>
-        </w:trPr>
-        <w:tc>
-          <w:tcPr>
-            <w:tcW w:type="dxa" w:w="5112"/>
-            <w:shd w:fill="F3F6F8"/>
-            <w:tcMar>
-              <w:top w:w="70" w:type="dxa"/>
-              <w:start w:w="110" w:type="dxa"/>
-              <w:bottom w:w="70" w:type="dxa"/>
-              <w:end w:w="110" w:type="dxa"/>
-            </w:tcMar>
-            <w:vAlign w:val="top"/>
-          </w:tcPr>
-          <w:p>
-            <w:pPr>
-              <w:spacing w:after="20"/>
-            </w:pPr>
-            <w:r>
-              <w:rPr>
-                <w:rFonts w:ascii="Aptos" w:hAnsi="Aptos"/>
-                <w:b/>
-                <w:color w:val="1F374E"/>
-                <w:sz w:val="16"/>
-              </w:rPr>
-              <w:t>MANUFACTURING LOGISTICS</w:t>
-            </w:r>
-          </w:p>
-          <w:p>
-            <w:pPr>
-              <w:spacing w:after="0" w:line="240" w:lineRule="auto"/>
-            </w:pPr>
-            <w:r>
-              <w:rPr>
-                <w:rFonts w:ascii="Aptos" w:hAnsi="Aptos"/>
-                <w:color w:val="232323"/>
-                <w:sz w:val="17"/>
-              </w:rPr>
-              <w:t>Maintained zero shipping and quality errors over three months at Hidaka USA and implemented workflow improvements producing ~$2K in weekly savings.</w:t>
-            </w:r>
-          </w:p>
-        </w:tc>
-        <w:tc>
-          <w:tcPr>
-            <w:tcW w:type="dxa" w:w="5112"/>
-            <w:shd w:fill="F3F6F8"/>
-            <w:tcMar>
-              <w:top w:w="70" w:type="dxa"/>
-              <w:start w:w="110" w:type="dxa"/>
-              <w:bottom w:w="70" w:type="dxa"/>
-              <w:end w:w="110" w:type="dxa"/>
-            </w:tcMar>
-            <w:vAlign w:val="top"/>
-          </w:tcPr>
-          <w:p>
-            <w:pPr>
-              <w:spacing w:after="20"/>
-            </w:pPr>
-            <w:r>
-              <w:rPr>
-                <w:rFonts w:ascii="Aptos" w:hAnsi="Aptos"/>
-                <w:b/>
-                <w:color w:val="1F374E"/>
-                <w:sz w:val="16"/>
-              </w:rPr>
-              <w:t>TECHNICAL DELIVERY</w:t>
-            </w:r>
-          </w:p>
-          <w:p>
-            <w:pPr>
-              <w:spacing w:after="0" w:line="240" w:lineRule="auto"/>
-            </w:pPr>
-            <w:r>
-              <w:rPr>
-                <w:rFonts w:ascii="Aptos" w:hAnsi="Aptos"/>
-                <w:color w:val="232323"/>
-                <w:sz w:val="17"/>
-              </w:rPr>
-              <w:t>Built, deployed, and sold AIncident, an operational reporting application, for $5K; experience with Power BI, SQL, Python, AWS, Docker, PostgreSQL, and TMS/WMS workflows.</w:t>
-            </w:r>
-          </w:p>
-        </w:tc>
-      </w:tr>
-    </w:tbl>
-    <w:p>
-      <w:pPr>
-        <w:keepNext/>
-        <w:spacing w:before="140" w:after="60"/>
-        <w:pBdr>
-          <w:bottom w:val="single" w:sz="8" w:space="2" w:color="B7C5D1"/>
-        </w:pBdr>
-      </w:pPr>
-      <w:r>
-        <w:rPr>
-          <w:rFonts w:ascii="Aptos" w:hAnsi="Aptos"/>
-          <w:b/>
-          <w:color w:val="1F374E"/>
-          <w:sz w:val="20"/>
-        </w:rPr>
-        <w:t>CORE CAPABILITIES</w:t>
+        <w:t>June 2026–Present | Plain City, Ohio</w:t>
       </w:r>
     </w:p>
     <w:p>
       <w:pPr>
-        <w:spacing w:after="40"/>
+        <w:ind w:left="187" w:hanging="144"/>
       </w:pPr>
       <w:r>
-        <w:rPr>
-          <w:rFonts w:ascii="Aptos" w:hAnsi="Aptos"/>
-          <w:color w:val="232323"/>
-          <w:sz w:val="17"/>
-        </w:rPr>
-        <w:t>Workforce Planning &amp; Development | Parcel Operations | Transportation &amp; Route Planning | Continuous Improvement | Quality &amp; Service KPIs | TMS/WMS Workflows | Blue Yonder | Power BI | SQL | Operational Reporting | AI-Augmented Full-Stack Development</w:t>
+        <w:t>• Set the facility’s unload pace record at 17,000 packages per hour while directing staffing and package flow.</w:t>
+      </w:r>
+    </w:p>
+    <w:p>
+      <w:pPr>
+        <w:ind w:left="187" w:hanging="144"/>
+      </w:pPr>
+      <w:r>
+        <w:t>• Coordinated 68 employees across unload and two load areas during a shift processing 73,000 packages, balancing labor and operating priorities as conditions changed.</w:t>
+      </w:r>
+    </w:p>
+    <w:p>
+      <w:pPr>
+        <w:ind w:left="187" w:hanging="144"/>
+      </w:pPr>
+      <w:r>
+        <w:t>• Use Blue Yonder for attendance and staffing; lead frontline coaching, performance management, quality coordination, and operational recovery.</w:t>
+      </w:r>
+    </w:p>
+    <w:p>
+      <w:pPr>
+        <w:ind w:left="187" w:hanging="144"/>
+      </w:pPr>
+      <w:r>
+        <w:t>• Develop trainers to run their areas with clear escalation paths, private coaching, and recognition of strong performance.</w:t>
+      </w:r>
+    </w:p>
+    <w:p>
+      <w:pPr>
+        <w:ind w:left="187" w:hanging="144"/>
+      </w:pPr>
+      <w:r>
+        <w:t>• Created resource packets for new supervisors covering production standards, work methods, translated instructions, and documentation; completed three injury reports.</w:t>
+      </w:r>
+    </w:p>
+    <w:p>
+      <w:pPr>
+        <w:pStyle w:val="Heading2"/>
+      </w:pPr>
+      <w:r>
+        <w:t>UPS | Dispatch &amp; Building Automation Supervisor</w:t>
       </w:r>
     </w:p>
     <w:p>
       <w:pPr>
         <w:keepNext/>
-        <w:spacing w:before="140" w:after="60"/>
-        <w:pBdr>
-          <w:bottom w:val="single" w:sz="8" w:space="2" w:color="B7C5D1"/>
-        </w:pBdr>
       </w:pPr>
       <w:r>
         <w:rPr>
-          <w:rFonts w:ascii="Aptos" w:hAnsi="Aptos"/>
-          <w:b/>
-          <w:color w:val="1F374E"/>
-          <w:sz w:val="20"/>
+          <w:color w:val="556575"/>
+          <w:sz w:val="17"/>
         </w:rPr>
-        <w:t>PROFESSIONAL EXPERIENCE</w:t>
+        <w:t>January 2023–May 2024</w:t>
+      </w:r>
+    </w:p>
+    <w:p>
+      <w:pPr>
+        <w:ind w:left="187" w:hanging="144"/>
+      </w:pPr>
+      <w:r>
+        <w:t>• Coordinated 70 drivers across multiple municipalities, managing route priorities, dispatch disruptions, and real-time service adjustments.</w:t>
+      </w:r>
+    </w:p>
+    <w:p>
+      <w:pPr>
+        <w:ind w:left="187" w:hanging="144"/>
+      </w:pPr>
+      <w:r>
+        <w:t>• Generated approximately $86,000 in estimated annual logistics savings through route optimization and workflow improvements.</w:t>
+      </w:r>
+    </w:p>
+    <w:p>
+      <w:pPr>
+        <w:ind w:left="187" w:hanging="144"/>
+      </w:pPr>
+      <w:r>
+        <w:t>• Reduced overtime by 20% through workforce balancing and transportation planning.</w:t>
+      </w:r>
+    </w:p>
+    <w:p>
+      <w:pPr>
+        <w:ind w:left="187" w:hanging="144"/>
+      </w:pPr>
+      <w:r>
+        <w:t>• Monitored automated sort-system conditions and belt/PLC controls, coordinating driver communication and service recovery when operating conditions changed.</w:t>
+      </w:r>
+    </w:p>
+    <w:p>
+      <w:pPr>
+        <w:pStyle w:val="Heading2"/>
+      </w:pPr>
+      <w:r>
+        <w:t>UPS | Operations Supervisor</w:t>
       </w:r>
     </w:p>
     <w:p>
       <w:pPr>
         <w:keepNext/>
-        <w:spacing w:before="56" w:after="10"/>
       </w:pPr>
       <w:r>
         <w:rPr>
-          <w:rFonts w:ascii="Aptos" w:hAnsi="Aptos"/>
-          <w:b/>
-          <w:color w:val="232323"/>
-          <w:sz w:val="19"/>
+          <w:color w:val="556575"/>
+          <w:sz w:val="17"/>
         </w:rPr>
-        <w:t>FedEx</w:t>
-      </w:r>
-      <w:r>
-        <w:rPr>
-          <w:rFonts w:ascii="Aptos" w:hAnsi="Aptos"/>
-          <w:b/>
-          <w:color w:val="1F374E"/>
-          <w:sz w:val="19"/>
-        </w:rPr>
-        <w:t xml:space="preserve"> | Operations Supervisor</w:t>
-      </w:r>
-      <w:r>
-        <w:rPr>
-          <w:rFonts w:ascii="Aptos" w:hAnsi="Aptos"/>
-          <w:color w:val="5F5F5F"/>
-          <w:sz w:val="18"/>
-        </w:rPr>
-        <w:t xml:space="preserve">   June 2026 - Present</w:t>
-      </w:r>
-      <w:r>
-        <w:rPr>
-          <w:rFonts w:ascii="Aptos" w:hAnsi="Aptos"/>
-          <w:color w:val="5F5F5F"/>
-          <w:sz w:val="18"/>
-        </w:rPr>
-        <w:t xml:space="preserve"> | Plain City, Ohio</w:t>
+        <w:t>August 2020–December 2022</w:t>
       </w:r>
     </w:p>
     <w:p>
       <w:pPr>
-        <w:pStyle w:val="ListBullet"/>
-        <w:spacing w:after="23" w:line="245" w:lineRule="auto"/>
-        <w:ind w:left="259" w:hanging="187"/>
+        <w:ind w:left="187" w:hanging="144"/>
       </w:pPr>
       <w:r>
-        <w:rPr>
-          <w:rFonts w:ascii="Aptos" w:hAnsi="Aptos"/>
-          <w:color w:val="232323"/>
-          <w:sz w:val="18"/>
-        </w:rPr>
-        <w:t>Lead staffing, package-flow execution, frontline coaching, quality coordination, and operational recovery in a high-volume parcel facility; use Blue Yonder for attendance and staffing workflows.</w:t>
+        <w:t>• Led 70+ employees in high-volume package distribution, overseeing labor allocation, scheduling, payroll, quality, safety, and employee development.</w:t>
       </w:r>
     </w:p>
     <w:p>
       <w:pPr>
-        <w:keepNext/>
-        <w:spacing w:before="56" w:after="10"/>
+        <w:ind w:left="187" w:hanging="144"/>
       </w:pPr>
       <w:r>
-        <w:rPr>
-          <w:rFonts w:ascii="Aptos" w:hAnsi="Aptos"/>
-          <w:b/>
-          <w:color w:val="232323"/>
-          <w:sz w:val="19"/>
-        </w:rPr>
-        <w:t>Hidaka USA</w:t>
-      </w:r>
-      <w:r>
-        <w:rPr>
-          <w:rFonts w:ascii="Aptos" w:hAnsi="Aptos"/>
-          <w:b/>
-          <w:color w:val="1F374E"/>
-          <w:sz w:val="19"/>
-        </w:rPr>
-        <w:t xml:space="preserve"> | TMS/WMS Specialist and Shipping Associate</w:t>
-      </w:r>
-      <w:r>
-        <w:rPr>
-          <w:rFonts w:ascii="Aptos" w:hAnsi="Aptos"/>
-          <w:color w:val="5F5F5F"/>
-          <w:sz w:val="18"/>
-        </w:rPr>
-        <w:t xml:space="preserve">   2026</w:t>
+        <w:t>• Reduced daily misloads from approximately 100 to fewer than 10 in three months through process improvement and frontline coaching.</w:t>
       </w:r>
     </w:p>
     <w:p>
       <w:pPr>
-        <w:pStyle w:val="ListBullet"/>
-        <w:spacing w:after="23" w:line="245" w:lineRule="auto"/>
-        <w:ind w:left="259" w:hanging="187"/>
+        <w:ind w:left="187" w:hanging="144"/>
       </w:pPr>
       <w:r>
-        <w:rPr>
-          <w:rFonts w:ascii="Aptos" w:hAnsi="Aptos"/>
-          <w:color w:val="232323"/>
-          <w:sz w:val="18"/>
-        </w:rPr>
-        <w:t>Supported outbound freight, receiving, inventory movement, production coordination, and transportation/warehouse systems in a manufacturing environment.</w:t>
+        <w:t>• That reduction represents approximately $1.17M in estimated annualized cost avoidance: 90 fewer misloads/day × UPS’s internal $50-per-misload cost figure × 260 operating days.</w:t>
       </w:r>
     </w:p>
     <w:p>
       <w:pPr>
-        <w:pStyle w:val="ListBullet"/>
-        <w:spacing w:after="23" w:line="245" w:lineRule="auto"/>
-        <w:ind w:left="259" w:hanging="187"/>
+        <w:ind w:left="187" w:hanging="144"/>
       </w:pPr>
       <w:r>
-        <w:rPr>
-          <w:rFonts w:ascii="Aptos" w:hAnsi="Aptos"/>
-          <w:color w:val="232323"/>
-          <w:sz w:val="18"/>
-        </w:rPr>
-        <w:t>Maintained zero shipping and quality errors over three months; implemented workflow improvements producing approximately $2,000 in weekly savings.</w:t>
+        <w:t>• Led operations supporting Pfizer COVID-19 vaccine distribution with zero distribution failures and 100% chain-of-custody integrity.</w:t>
       </w:r>
     </w:p>
     <w:p>
       <w:pPr>
-        <w:keepNext/>
-        <w:spacing w:before="56" w:after="10"/>
+        <w:ind w:left="187" w:hanging="144"/>
       </w:pPr>
       <w:r>
-        <w:t>Schneider | Transportation Planning and Dispatch — SFS Contract   September–November 2025</w:t>
+        <w:t>• Maintained operating continuity through COVID-era peak conditions while managing attendance, performance coaching, and corrective action.</w:t>
       </w:r>
     </w:p>
     <w:p>
-      <w:pPr>
-        <w:pStyle w:val="ListBullet"/>
-        <w:spacing w:after="23" w:line="245" w:lineRule="auto"/>
-        <w:ind w:left="259" w:hanging="187"/>
-      </w:pPr>
-      <w:r>
-        <w:t>Contracted through Security Flaw Solutions on the implementation team launching Schneider’s Kroger account; coordinated dispatch, scheduling, shipment tracking, and operational reporting.</w:t>
-      </w:r>
-    </w:p>
-    <w:p>
-      <w:pPr>
-        <w:keepNext/>
-        <w:spacing w:before="56" w:after="10"/>
-      </w:pPr>
-      <w:r>
-        <w:rPr>
-          <w:rFonts w:ascii="Aptos" w:hAnsi="Aptos"/>
-          <w:b/>
-          <w:color w:val="232323"/>
-          <w:sz w:val="19"/>
-        </w:rPr>
-        <w:t>Target</w:t>
-      </w:r>
-      <w:r>
-        <w:rPr>
-          <w:rFonts w:ascii="Aptos" w:hAnsi="Aptos"/>
-          <w:b/>
-          <w:color w:val="1F374E"/>
-          <w:sz w:val="19"/>
-        </w:rPr>
-        <w:t xml:space="preserve"> | Security Specialist, Asset Protection</w:t>
-      </w:r>
-      <w:r>
-        <w:rPr>
-          <w:rFonts w:ascii="Aptos" w:hAnsi="Aptos"/>
-          <w:color w:val="5F5F5F"/>
-          <w:sz w:val="18"/>
-        </w:rPr>
-        <w:t xml:space="preserve">   2024 - 2025</w:t>
-      </w:r>
-    </w:p>
-    <w:p>
-      <w:pPr>
-        <w:pStyle w:val="ListBullet"/>
-        <w:spacing w:after="23" w:line="245" w:lineRule="auto"/>
-        <w:ind w:left="259" w:hanging="187"/>
-      </w:pPr>
-      <w:r>
-        <w:rPr>
-          <w:rFonts w:ascii="Aptos" w:hAnsi="Aptos"/>
-          <w:color w:val="232323"/>
-          <w:sz w:val="18"/>
-        </w:rPr>
-        <w:t>Supported theft/fraud investigations, evidence collection, case documentation, and safety standards; worked with TrueEye and TruScan automated skip-scan detection workflows.</w:t>
-      </w:r>
-    </w:p>
-    <w:p>
-      <w:pPr>
-        <w:spacing w:after="0"/>
-      </w:pPr>
       <w:r>
         <w:br w:type="page"/>
       </w:r>
     </w:p>
     <w:p>
       <w:pPr>
-        <w:keepNext/>
-        <w:spacing w:before="56" w:after="10"/>
+        <w:pStyle w:val="Heading1"/>
       </w:pPr>
       <w:r>
-        <w:rPr>
-          <w:rFonts w:ascii="Aptos" w:hAnsi="Aptos"/>
-          <w:b/>
-          <w:color w:val="232323"/>
-          <w:sz w:val="19"/>
-        </w:rPr>
-        <w:t>UPS</w:t>
-      </w:r>
-      <w:r>
-        <w:rPr>
-          <w:rFonts w:ascii="Aptos" w:hAnsi="Aptos"/>
-          <w:b/>
-          <w:color w:val="1F374E"/>
-          <w:sz w:val="19"/>
-        </w:rPr>
-        <w:t xml:space="preserve"> | Dispatch and Building Automation Supervisor</w:t>
-      </w:r>
-      <w:r>
-        <w:rPr>
-          <w:rFonts w:ascii="Aptos" w:hAnsi="Aptos"/>
-          <w:color w:val="5F5F5F"/>
-          <w:sz w:val="18"/>
-        </w:rPr>
-        <w:t xml:space="preserve">   January 2023 - May 2024</w:t>
+        <w:t>MANUFACTURING, SYSTEMS &amp; PRODUCT DELIVERY</w:t>
       </w:r>
     </w:p>
     <w:p>
       <w:pPr>
-        <w:pStyle w:val="ListBullet"/>
-        <w:spacing w:after="23" w:line="245" w:lineRule="auto"/>
-        <w:ind w:left="259" w:hanging="187"/>
+        <w:pStyle w:val="Heading2"/>
       </w:pPr>
       <w:r>
-        <w:rPr>
-          <w:rFonts w:ascii="Aptos" w:hAnsi="Aptos"/>
-          <w:color w:val="232323"/>
-          <w:sz w:val="18"/>
-        </w:rPr>
-        <w:t>Coordinated 70 drivers across multiple municipalities, managing route priorities, dispatch, service disruptions, and real-time operating adjustments.</w:t>
-      </w:r>
-    </w:p>
-    <w:p>
-      <w:pPr>
-        <w:pStyle w:val="ListBullet"/>
-        <w:spacing w:after="23" w:line="245" w:lineRule="auto"/>
-        <w:ind w:left="259" w:hanging="187"/>
-      </w:pPr>
-      <w:r>
-        <w:rPr>
-          <w:rFonts w:ascii="Aptos" w:hAnsi="Aptos"/>
-          <w:color w:val="232323"/>
-          <w:sz w:val="18"/>
-        </w:rPr>
-        <w:t>Generated approximately $86,000 in estimated annual logistics savings through route optimization and workflow improvements; reduced overtime 20% through workforce balancing.</w:t>
-      </w:r>
-    </w:p>
-    <w:p>
-      <w:pPr>
-        <w:pStyle w:val="ListBullet"/>
-        <w:spacing w:after="23" w:line="245" w:lineRule="auto"/>
-        <w:ind w:left="259" w:hanging="187"/>
-      </w:pPr>
-      <w:r>
-        <w:rPr>
-          <w:rFonts w:ascii="Aptos" w:hAnsi="Aptos"/>
-          <w:color w:val="232323"/>
-          <w:sz w:val="18"/>
-        </w:rPr>
-        <w:t>Monitored automated sort-system conditions and maintained service reliability while coordinating driver communication and dispatch changes.</w:t>
+        <w:t>Hidaka USA | TMS/WMS Specialist &amp; Shipping Associate</w:t>
       </w:r>
     </w:p>
     <w:p>
       <w:pPr>
         <w:keepNext/>
-        <w:spacing w:before="56" w:after="10"/>
       </w:pPr>
       <w:r>
         <w:rPr>
-          <w:rFonts w:ascii="Aptos" w:hAnsi="Aptos"/>
-          <w:b/>
-          <w:color w:val="232323"/>
-          <w:sz w:val="19"/>
+          <w:color w:val="556575"/>
+          <w:sz w:val="17"/>
         </w:rPr>
-        <w:t>UPS</w:t>
-      </w:r>
-      <w:r>
-        <w:rPr>
-          <w:rFonts w:ascii="Aptos" w:hAnsi="Aptos"/>
-          <w:b/>
-          <w:color w:val="1F374E"/>
-          <w:sz w:val="19"/>
-        </w:rPr>
-        <w:t xml:space="preserve"> | Operations Supervisor</w:t>
-      </w:r>
-      <w:r>
-        <w:rPr>
-          <w:rFonts w:ascii="Aptos" w:hAnsi="Aptos"/>
-          <w:color w:val="5F5F5F"/>
-          <w:sz w:val="18"/>
-        </w:rPr>
-        <w:t xml:space="preserve">   August 2020 - December 2022</w:t>
+        <w:t>2026</w:t>
       </w:r>
     </w:p>
     <w:p>
       <w:pPr>
-        <w:pStyle w:val="ListBullet"/>
-        <w:spacing w:after="23" w:line="245" w:lineRule="auto"/>
-        <w:ind w:left="259" w:hanging="187"/>
+        <w:ind w:left="187" w:hanging="144"/>
       </w:pPr>
       <w:r>
-        <w:rPr>
-          <w:rFonts w:ascii="Aptos" w:hAnsi="Aptos"/>
-          <w:color w:val="232323"/>
-          <w:sz w:val="18"/>
-        </w:rPr>
-        <w:t>Led 70+ employees in a high-volume package distribution operation, managing labor allocation, quality, safety, service performance, and employee development.</w:t>
+        <w:t>• Supported manufacturing logistics through outbound freight, receiving, inventory movement, and production coordination using transportation and warehouse workflows.</w:t>
       </w:r>
     </w:p>
     <w:p>
       <w:pPr>
-        <w:pStyle w:val="ListBullet"/>
-        <w:spacing w:after="23" w:line="245" w:lineRule="auto"/>
-        <w:ind w:left="259" w:hanging="187"/>
+        <w:ind w:left="187" w:hanging="144"/>
       </w:pPr>
       <w:r>
-        <w:t>Reduced daily misloads from approximately 100 to fewer than 10 over three months; ~$1.17M estimated annualized cost avoidance using 90 fewer misloads/day x UPS’s internal $50-per-misload cost figure x 260 operating days.</w:t>
+        <w:t>• Maintained zero shipping and quality errors over three months.</w:t>
       </w:r>
     </w:p>
     <w:p>
       <w:pPr>
-        <w:pStyle w:val="ListBullet"/>
-        <w:spacing w:after="23" w:line="245" w:lineRule="auto"/>
-        <w:ind w:left="259" w:hanging="187"/>
+        <w:ind w:left="187" w:hanging="144"/>
       </w:pPr>
       <w:r>
-        <w:rPr>
-          <w:rFonts w:ascii="Aptos" w:hAnsi="Aptos"/>
-          <w:color w:val="232323"/>
-          <w:sz w:val="18"/>
-        </w:rPr>
-        <w:t>Led operations supporting Pfizer COVID-19 vaccine distribution with zero distribution failures and 100% chain-of-custody integrity.</w:t>
+        <w:t>• Implemented workflow improvements producing approximately $2,000 in weekly savings.</w:t>
+      </w:r>
+    </w:p>
+    <w:p>
+      <w:pPr>
+        <w:ind w:left="187" w:hanging="144"/>
+      </w:pPr>
+      <w:r>
+        <w:t>• Worked with blueprints, press-brake processes, and forklift operations to support accurate production and material movement.</w:t>
+      </w:r>
+    </w:p>
+    <w:p>
+      <w:pPr>
+        <w:pStyle w:val="Heading2"/>
+      </w:pPr>
+      <w:r>
+        <w:t>Security Flaw Solutions | Founder &amp; Lead Developer</w:t>
       </w:r>
     </w:p>
     <w:p>
       <w:pPr>
         <w:keepNext/>
-        <w:spacing w:before="140" w:after="60"/>
-        <w:pBdr>
-          <w:bottom w:val="single" w:sz="8" w:space="2" w:color="B7C5D1"/>
-        </w:pBdr>
       </w:pPr>
       <w:r>
         <w:rPr>
-          <w:rFonts w:ascii="Aptos" w:hAnsi="Aptos"/>
-          <w:b/>
-          <w:color w:val="1F374E"/>
-          <w:sz w:val="20"/>
+          <w:color w:val="556575"/>
+          <w:sz w:val="17"/>
         </w:rPr>
-        <w:t>INDEPENDENT PRODUCT DELIVERY</w:t>
+        <w:t>2025–2026</w:t>
+      </w:r>
+    </w:p>
+    <w:p>
+      <w:pPr>
+        <w:ind w:left="187" w:hanging="144"/>
+      </w:pPr>
+      <w:r>
+        <w:t>• Built, deployed, and sold AIncident, an AI-powered incident-reporting SaaS product, through Flippa for $4,995.</w:t>
+      </w:r>
+    </w:p>
+    <w:p>
+      <w:pPr>
+        <w:ind w:left="187" w:hanging="144"/>
+      </w:pPr>
+      <w:r>
+        <w:t>• Owned requirements, development, deployment, and commercialization; delivered role-based access, GPT summaries, PDF reporting, and Stripe subscription billing.</w:t>
+      </w:r>
+    </w:p>
+    <w:p>
+      <w:pPr>
+        <w:ind w:left="187" w:hanging="144"/>
+      </w:pPr>
+      <w:r>
+        <w:t>• Built reporting workflows with Python, FastAPI, PostgreSQL, and Streamlit, with AWS and Docker deployment experience.</w:t>
+      </w:r>
+    </w:p>
+    <w:p>
+      <w:pPr>
+        <w:ind w:left="187" w:hanging="144"/>
+      </w:pPr>
+      <w:r>
+        <w:t>• Used AI-assisted development alongside troubleshooting and operational requirements analysis to turn a reporting need into a delivered commercial product.</w:t>
+      </w:r>
+    </w:p>
+    <w:p>
+      <w:pPr>
+        <w:pStyle w:val="Heading2"/>
+      </w:pPr>
+      <w:r>
+        <w:t>Schneider / Kroger Implementation | Transportation Planning &amp; Systems Integration — SFS Contract</w:t>
       </w:r>
     </w:p>
     <w:p>
       <w:pPr>
         <w:keepNext/>
-        <w:spacing w:before="56" w:after="10"/>
       </w:pPr>
       <w:r>
         <w:rPr>
-          <w:rFonts w:ascii="Aptos" w:hAnsi="Aptos"/>
-          <w:b/>
-          <w:color w:val="232323"/>
-          <w:sz w:val="19"/>
+          <w:color w:val="556575"/>
+          <w:sz w:val="17"/>
         </w:rPr>
-        <w:t>Security Flaw Solutions</w:t>
-      </w:r>
-      <w:r>
-        <w:rPr>
-          <w:rFonts w:ascii="Aptos" w:hAnsi="Aptos"/>
-          <w:b/>
-          <w:color w:val="1F374E"/>
-          <w:sz w:val="19"/>
-        </w:rPr>
-        <w:t xml:space="preserve"> | Founder &amp; Lead Developer</w:t>
-      </w:r>
-      <w:r>
-        <w:rPr>
-          <w:rFonts w:ascii="Aptos" w:hAnsi="Aptos"/>
-          <w:color w:val="5F5F5F"/>
-          <w:sz w:val="18"/>
-        </w:rPr>
-        <w:t xml:space="preserve">   2025 - 2026</w:t>
+        <w:t>September–November 2025</w:t>
       </w:r>
     </w:p>
     <w:p>
       <w:pPr>
-        <w:pStyle w:val="ListBullet"/>
-        <w:spacing w:after="23" w:line="245" w:lineRule="auto"/>
-        <w:ind w:left="259" w:hanging="187"/>
+        <w:ind w:left="187" w:hanging="144"/>
       </w:pPr>
       <w:r>
-        <w:t>Designed, built, deployed, and sold AIncident, an AI-powered operational reporting platform, for $4,995 from requirements through commercial delivery.</w:t>
+        <w:t>• Contracted through Security Flaw Solutions to support implementation of Schneider’s new Kroger account and critical food-shipment operations.</w:t>
       </w:r>
     </w:p>
     <w:p>
       <w:pPr>
-        <w:pStyle w:val="ListBullet"/>
-        <w:spacing w:after="23" w:line="245" w:lineRule="auto"/>
-        <w:ind w:left="259" w:hanging="187"/>
+        <w:ind w:left="187" w:hanging="144"/>
       </w:pPr>
       <w:r>
-        <w:rPr>
-          <w:rFonts w:ascii="Aptos" w:hAnsi="Aptos"/>
-          <w:color w:val="232323"/>
-          <w:sz w:val="18"/>
-        </w:rPr>
-        <w:t>Built application workflows with Python, FastAPI, PostgreSQL, Streamlit, AWS, and Docker; applied operations experience to structured reporting and usable software.</w:t>
+        <w:t>• Supported integration of Schneider transportation data with Kroger’s legacy load database for order creation, lane mapping, and data synchronization.</w:t>
+      </w:r>
+    </w:p>
+    <w:p>
+      <w:pPr>
+        <w:ind w:left="187" w:hanging="144"/>
+      </w:pPr>
+      <w:r>
+        <w:t>• Coordinated fleet dispatch, scheduling, shipment tracking, and operational reporting; resolved scheduling conflicts and maintained transportation documentation.</w:t>
+      </w:r>
+    </w:p>
+    <w:p>
+      <w:pPr>
+        <w:pStyle w:val="Heading2"/>
+      </w:pPr>
+      <w:r>
+        <w:t>Target | Security Specialist, Asset Protection</w:t>
       </w:r>
     </w:p>
     <w:p>
       <w:pPr>
         <w:keepNext/>
-        <w:spacing w:before="140" w:after="60"/>
-        <w:pBdr>
-          <w:bottom w:val="single" w:sz="8" w:space="2" w:color="B7C5D1"/>
-        </w:pBdr>
       </w:pPr>
       <w:r>
         <w:rPr>
-          <w:rFonts w:ascii="Aptos" w:hAnsi="Aptos"/>
-          <w:b/>
-          <w:color w:val="1F374E"/>
-          <w:sz w:val="20"/>
+          <w:color w:val="556575"/>
+          <w:sz w:val="17"/>
         </w:rPr>
-        <w:t>TECHNICAL SKILLS</w:t>
+        <w:t>2024–2025</w:t>
       </w:r>
     </w:p>
     <w:p>
       <w:pPr>
-        <w:spacing w:after="20"/>
+        <w:ind w:left="187" w:hanging="144"/>
       </w:pPr>
       <w:r>
-        <w:rPr>
-          <w:rFonts w:ascii="Aptos" w:hAnsi="Aptos"/>
-          <w:color w:val="232323"/>
-          <w:sz w:val="17"/>
-        </w:rPr>
-        <w:t>Power BI | SQL | Python | FastAPI | PostgreSQL | Streamlit | AWS | Docker | Microsoft Excel | TMS/WMS Workflows | Blue Yonder Staffing &amp; Attendance | AI-Augmented Full-Stack Development</w:t>
+        <w:t>• Contributed to an 11% reduction in shrink through theft/fraud investigation, evidence collection, and case documentation.</w:t>
       </w:r>
     </w:p>
     <w:p>
       <w:pPr>
-        <w:keepNext/>
-        <w:spacing w:before="140" w:after="60"/>
-        <w:pBdr>
-          <w:bottom w:val="single" w:sz="8" w:space="2" w:color="B7C5D1"/>
-        </w:pBdr>
+        <w:ind w:left="187" w:hanging="144"/>
       </w:pPr>
       <w:r>
-        <w:rPr>
-          <w:rFonts w:ascii="Aptos" w:hAnsi="Aptos"/>
-          <w:b/>
-          <w:color w:val="1F374E"/>
-          <w:sz w:val="20"/>
-        </w:rPr>
-        <w:t>EDUCATION &amp; PROFESSIONAL DEVELOPMENT</w:t>
+        <w:t>• Set a regional record with six apprehensions in one shift.</w:t>
       </w:r>
     </w:p>
     <w:p>
       <w:pPr>
-        <w:spacing w:after="0"/>
+        <w:ind w:left="187" w:hanging="144"/>
       </w:pPr>
       <w:r>
-        <w:rPr>
-          <w:rFonts w:ascii="Aptos" w:hAnsi="Aptos"/>
-          <w:b/>
-          <w:sz w:val="18"/>
-        </w:rPr>
-        <w:t>Mechanical Engineering coursework, University of Cincinnati</w:t>
-      </w:r>
-      <w:r>
-        <w:rPr>
-          <w:rFonts w:ascii="Aptos" w:hAnsi="Aptos"/>
-          <w:sz w:val="18"/>
-        </w:rPr>
-        <w:t xml:space="preserve">  |  High School Diploma, Hilliard Davidson High School</w:t>
+        <w:t>• Worked with TrueEye and TruScan automated skip-scan detection workflows; coordinated with law enforcement and maintained safety standards.</w:t>
       </w:r>
     </w:p>
     <w:p>
       <w:pPr>
-        <w:spacing w:after="0"/>
+        <w:pStyle w:val="Heading1"/>
       </w:pPr>
       <w:r>
-        <w:rPr>
-          <w:rFonts w:ascii="Aptos" w:hAnsi="Aptos"/>
-          <w:color w:val="232323"/>
-          <w:sz w:val="17"/>
-        </w:rPr>
-        <w:t>Certified Forklift Operator | FedEx QDM coursework in progress | IBM AI Engineering Professional Certificate in progress</w:t>
+        <w:t>SELECTED TECHNICAL PROJECTS</w:t>
+      </w:r>
+    </w:p>
+    <w:p>
+      <w:r>
+        <w:t>FlowCheck: Python/SQL WMS–TMS reconciliation with validation, idempotent batches, and audit evidence. ShiftLens: reproducible SQL analysis, Power BI measures, and an interactive warehouse KPI dashboard. Sort planner and dispatch dashboard: synthetic-data tools for staffing and exception review.</w:t>
+      </w:r>
+    </w:p>
+    <w:p>
+      <w:pPr>
+        <w:pStyle w:val="Heading1"/>
+      </w:pPr>
+      <w:r>
+        <w:t>EDUCATION &amp; DEVELOPMENT</w:t>
+      </w:r>
+    </w:p>
+    <w:p>
+      <w:r>
+        <w:t>University of Cincinnati — Mechanical Engineering coursework</w:t>
+        <w:br/>
+        <w:t>Hilliard Davidson High School — High School Diploma</w:t>
+        <w:br/>
+        <w:t>Certified Forklift Operator • FedEx QDM coursework in progress • IBM AI Engineering certificate in progress</w:t>
       </w:r>
     </w:p>
     <w:sectPr>
-      <w:footerReference w:type="default" r:id="rId10"/>
       <w:pgSz w:w="12240" w:h="15840"/>
-      <w:pgMar w:top="605" w:right="792" w:bottom="605" w:left="792" w:header="288" w:footer="288" w:gutter="0"/>
+      <w:pgMar w:top="605" w:right="763" w:bottom="720" w:left="763" w:header="720" w:footer="720" w:gutter="0"/>
       <w:cols w:space="720"/>
       <w:docGrid w:linePitch="360"/>
     </w:sectPr>
   </w:body>
 </w:document>
-</file>
-
-<file path=word/footer1.xml><?xml version="1.0" encoding="utf-8"?>
-<w:ftr xmlns:m="http://schemas.openxmlformats.org/officeDocument/2006/math" xmlns:mc="http://schemas.openxmlformats.org/markup-compatibility/2006" xmlns:mo="http://schemas.microsoft.com/office/mac/office/2008/main" xmlns:mv="urn:schemas-microsoft-com:mac:vml" xmlns:o="urn:schemas-microsoft-com:office:office" xmlns:r="http://schemas.openxmlformats.org/officeDocument/2006/relationships" xmlns:v="urn:schemas-microsoft-com:vml" xmlns:w10="urn:schemas-microsoft-com:office:word" xmlns:w14="http://schemas.microsoft.com/office/word/2010/wordml" xmlns:w="http://schemas.openxmlformats.org/wordprocessingml/2006/main" xmlns:wne="http://schemas.microsoft.com/office/word/2006/wordml" xmlns:wp14="http://schemas.microsoft.com/office/word/2010/wordprocessingDrawing" xmlns:wp="http://schemas.openxmlformats.org/drawingml/2006/wordprocessingDrawing" xmlns:wpc="http://schemas.microsoft.com/office/word/2010/wordprocessingCanvas" xmlns:wpg="http://schemas.microsoft.com/office/word/2010/wordprocessingGroup" xmlns:wpi="http://schemas.microsoft.com/office/word/2010/wordprocessingInk" xmlns:wps="http://schemas.microsoft.com/office/word/2010/wordprocessingShape" mc:Ignorable="w14 wp14">
-  <w:p>
-    <w:pPr>
-      <w:pStyle w:val="Footer"/>
-      <w:jc w:val="center"/>
-    </w:pPr>
-    <w:r>
-      <w:rPr>
-        <w:rFonts w:ascii="Aptos" w:hAnsi="Aptos"/>
-        <w:color w:val="5F5F5F"/>
-        <w:sz w:val="15"/>
-      </w:rPr>
-      <w:t>Hari Simran Khalsa</w:t>
-    </w:r>
-    <w:r>
-      <w:rPr>
-        <w:color w:val="5F5F5F"/>
-        <w:sz w:val="15"/>
-      </w:rPr>
-      <w:t xml:space="preserve">  |  </w:t>
-    </w:r>
-    <w:fldSimple w:instr="PAGE"/>
-  </w:p>
-</w:ftr>
 </file>
 
 <file path=word/numbering.xml><?xml version="1.0" encoding="utf-8"?>
@@ -1253,11 +840,10 @@
     <w:qFormat/>
     <w:rsid w:val="00FC693F"/>
     <w:pPr>
-      <w:spacing w:after="0" w:line="240" w:lineRule="auto"/>
+      <w:spacing w:after="60" w:line="247" w:lineRule="auto"/>
     </w:pPr>
     <w:rPr>
-      <w:rFonts w:ascii="Aptos" w:hAnsi="Aptos"/>
-      <w:color w:val="232323"/>
+      <w:rFonts w:ascii="Calibri" w:hAnsi="Calibri"/>
       <w:sz w:val="18"/>
     </w:rPr>
   </w:style>
@@ -1316,15 +902,15 @@
     <w:pPr>
       <w:keepNext/>
       <w:keepLines/>
-      <w:spacing w:before="480" w:after="0"/>
+      <w:spacing w:before="140" w:after="60"/>
       <w:outlineLvl w:val="0"/>
     </w:pPr>
     <w:rPr>
-      <w:rFonts w:asciiTheme="majorHAnsi" w:eastAsiaTheme="majorEastAsia" w:hAnsiTheme="majorHAnsi" w:cstheme="majorBidi"/>
+      <w:rFonts w:asciiTheme="majorHAnsi" w:eastAsiaTheme="majorEastAsia" w:hAnsiTheme="majorHAnsi" w:cstheme="majorBidi" w:ascii="Calibri" w:hAnsi="Calibri"/>
       <w:b/>
       <w:bCs/>
-      <w:color w:val="365F91" w:themeColor="accent1" w:themeShade="BF"/>
-      <w:sz w:val="28"/>
+      <w:color w:val="142B43"/>
+      <w:sz w:val="20"/>
       <w:szCs w:val="28"/>
     </w:rPr>
   </w:style>
@@ -1340,15 +926,15 @@
     <w:pPr>
       <w:keepNext/>
       <w:keepLines/>
-      <w:spacing w:before="200" w:after="0"/>
+      <w:spacing w:before="140" w:after="60"/>
       <w:outlineLvl w:val="1"/>
     </w:pPr>
     <w:rPr>
-      <w:rFonts w:asciiTheme="majorHAnsi" w:eastAsiaTheme="majorEastAsia" w:hAnsiTheme="majorHAnsi" w:cstheme="majorBidi"/>
+      <w:rFonts w:asciiTheme="majorHAnsi" w:eastAsiaTheme="majorEastAsia" w:hAnsiTheme="majorHAnsi" w:cstheme="majorBidi" w:ascii="Calibri" w:hAnsi="Calibri"/>
       <w:b/>
       <w:bCs/>
-      <w:color w:val="4F81BD" w:themeColor="accent1"/>
-      <w:sz w:val="26"/>
+      <w:color w:val="142B43"/>
+      <w:sz w:val="20"/>
       <w:szCs w:val="26"/>
     </w:rPr>
   </w:style>
@@ -1789,10 +1375,6 @@
       </w:numPr>
       <w:contextualSpacing/>
     </w:pPr>
-    <w:rPr>
-      <w:rFonts w:ascii="Aptos" w:hAnsi="Aptos"/>
-      <w:sz w:val="18"/>
-    </w:rPr>
   </w:style>
   <w:style w:type="paragraph" w:styleId="ListBullet2">
     <w:name w:val="List Bullet 2"/>

</xml_diff>

<commit_message>
Update FedEx resume with leadership development and QDM completion
</commit_message>
<xml_diff>
--- a/Hari_Simran_Khalsa_Operations_Resume.docx
+++ b/Hari_Simran_Khalsa_Operations_Resume.docx
@@ -84,7 +84,7 @@
         <w:ind w:left="187" w:hanging="144"/>
       </w:pPr>
       <w:r>
-        <w:t>• Set the facility’s unload pace record at 17,000 packages per hour while directing staffing and package flow.</w:t>
+        <w:t>• Developed fellow supervisors and trainers by providing resources on production standards, work methods, translated instructions, and operational documentation.</w:t>
       </w:r>
     </w:p>
     <w:p>
@@ -92,7 +92,7 @@
         <w:ind w:left="187" w:hanging="144"/>
       </w:pPr>
       <w:r>
-        <w:t>• Coordinated 68 employees across unload and two load areas during a shift processing 73,000 packages, balancing labor and operating priorities as conditions changed.</w:t>
+        <w:t>• Helped build a culture of accountability by administering discipline and recognizing and rewarding employees through QRP.</w:t>
       </w:r>
     </w:p>
     <w:p>
@@ -116,7 +116,7 @@
         <w:ind w:left="187" w:hanging="144"/>
       </w:pPr>
       <w:r>
-        <w:t>• Created resource packets for new supervisors covering production standards, work methods, translated instructions, and documentation; completed three injury reports.</w:t>
+        <w:t>• Completed all FedEx QDM courses; support injury reporting and operational documentation.</w:t>
       </w:r>
     </w:p>
     <w:p>
@@ -463,7 +463,7 @@
         <w:br/>
         <w:t>Hilliard Davidson High School — High School Diploma</w:t>
         <w:br/>
-        <w:t>Certified Forklift Operator • FedEx QDM coursework in progress • IBM AI Engineering certificate in progress</w:t>
+        <w:t>Certified Forklift Operator • All FedEx QDM courses completed • IBM AI Engineering certificate in progress</w:t>
       </w:r>
     </w:p>
     <w:sectPr>

</xml_diff>

<commit_message>
Replace Blue Yonder with tugger certification and driver development
</commit_message>
<xml_diff>
--- a/Hari_Simran_Khalsa_Operations_Resume.docx
+++ b/Hari_Simran_Khalsa_Operations_Resume.docx
@@ -48,7 +48,7 @@
     </w:p>
     <w:p>
       <w:r>
-        <w:t>Team leadership &amp; coaching • Workforce planning • Continuous improvement • Dispatch &amp; route planning • Quality &amp; service KPIs • TMS/WMS workflows • Blue Yonder • Excel • SQL • Power BI • Python • FastAPI • PostgreSQL • AWS • Docker</w:t>
+        <w:t>Team leadership &amp; coaching • Workforce planning • Continuous improvement • Dispatch &amp; route planning • Quality &amp; service KPIs • TMS/WMS workflows • Excel • SQL • Power BI • Python • FastAPI • PostgreSQL • AWS • Docker</w:t>
       </w:r>
     </w:p>
     <w:p>
@@ -100,7 +100,7 @@
         <w:ind w:left="187" w:hanging="144"/>
       </w:pPr>
       <w:r>
-        <w:t>• Use Blue Yonder for attendance and staffing; lead frontline coaching, performance management, quality coordination, and operational recovery.</w:t>
+        <w:t>• Earned tugger certification and work on developing and training new drivers.</w:t>
       </w:r>
     </w:p>
     <w:p>

</xml_diff>

<commit_message>
Highlight UPS supervisor development and refresh operations resume
</commit_message>
<xml_diff>
--- a/Hari_Simran_Khalsa_Operations_Resume.docx
+++ b/Hari_Simran_Khalsa_Operations_Resume.docx
@@ -35,7 +35,7 @@
     </w:p>
     <w:p>
       <w:r>
-        <w:t>Operations and systems leader with 5+ years across parcel distribution, dispatch, manufacturing logistics, and software delivery. Led 70+ employees and coordinated 70 drivers; delivered measurable improvements in quality, labor utilization, and transportation costs. Builds practical tools that connect frontline requirements with clear data and operational decisions.</w:t>
+        <w:t>Operations and systems leader with 5+ years across parcel distribution, dispatch, manufacturing logistics, and software delivery. Managed and developed supervisors, led 70+ employees, and coordinated 70 drivers; delivered measurable improvements in quality, labor utilization, and transportation costs. Builds practical tools that connect frontline requirements with clear data and operational decisions.</w:t>
       </w:r>
     </w:p>
     <w:p>
@@ -197,6 +197,14 @@
       </w:pPr>
       <w:r>
         <w:t>• Led 70+ employees in high-volume package distribution, overseeing labor allocation, scheduling, payroll, quality, safety, and employee development.</w:t>
+      </w:r>
+    </w:p>
+    <w:p>
+      <w:pPr>
+        <w:ind w:left="187" w:hanging="144"/>
+      </w:pPr>
+      <w:r>
+        <w:t>• Managed and developed UPS supervisors who advanced into full-time driver supervisor and dispatch supervisor roles.</w:t>
       </w:r>
     </w:p>
     <w:p>

</xml_diff>

<commit_message>
Detail development of five UPS supervisors and sustained results
</commit_message>
<xml_diff>
--- a/Hari_Simran_Khalsa_Operations_Resume.docx
+++ b/Hari_Simran_Khalsa_Operations_Resume.docx
@@ -35,7 +35,7 @@
     </w:p>
     <w:p>
       <w:r>
-        <w:t>Operations and systems leader with 5+ years across parcel distribution, dispatch, manufacturing logistics, and software delivery. Managed and developed supervisors, led 70+ employees, and coordinated 70 drivers; delivered measurable improvements in quality, labor utilization, and transportation costs. Builds practical tools that connect frontline requirements with clear data and operational decisions.</w:t>
+        <w:t>Operations and systems leader with 5+ years across parcel distribution, dispatch, manufacturing logistics, and software delivery. Managed and developed five supervisors, with two earning promotions; led 70+ employees, and coordinated 70 drivers; delivered measurable improvements in quality, labor utilization, and transportation costs. Builds practical tools that connect frontline requirements with clear data and operational decisions.</w:t>
       </w:r>
     </w:p>
     <w:p>
@@ -204,7 +204,7 @@
         <w:ind w:left="187" w:hanging="144"/>
       </w:pPr>
       <w:r>
-        <w:t>• Managed and developed UPS supervisors who advanced into full-time driver supervisor and dispatch supervisor roles.</w:t>
+        <w:t>• Managed and developed five UPS supervisors; two advanced into full-time driver supervisor and dispatch supervisor roles.</w:t>
       </w:r>
     </w:p>
     <w:p>
@@ -212,7 +212,15 @@
         <w:ind w:left="187" w:hanging="144"/>
       </w:pPr>
       <w:r>
-        <w:t>• Reduced daily misloads from approximately 100 to fewer than 10 in three months through process improvement and frontline coaching.</w:t>
+        <w:t>• Developed supervisors through knowledge sharing, delegated responsibilities, guidance during disciplinary meetings, and enrollment in internal training courses.</w:t>
+      </w:r>
+    </w:p>
+    <w:p>
+      <w:pPr>
+        <w:ind w:left="187" w:hanging="144"/>
+      </w:pPr>
+      <w:r>
+        <w:t>• Reduced daily misloads from approximately 100 to fewer than 10 in three months through process improvement and frontline coaching; sustained the improvement throughout my remaining UPS tenure.</w:t>
       </w:r>
     </w:p>
     <w:p>

</xml_diff>